<commit_message>
revised CV and updated radar plot
</commit_message>
<xml_diff>
--- a/files/Zihan_Hei_CV.docx
+++ b/files/Zihan_Hei_CV.docx
@@ -471,7 +471,6 @@
           <w:p>
             <w:pPr>
               <w:rPr>
-                <w:rFonts w:ascii="Lora" w:hAnsi="Lora"/>
                 <w:sz w:val="20"/>
                 <w:szCs w:val="20"/>
               </w:rPr>
@@ -484,14 +483,27 @@
                   <w:sz w:val="20"/>
                   <w:szCs w:val="20"/>
                 </w:rPr>
-                <w:t>z</w:t>
+                <w:t>zhei@binghamton.edu</w:t>
               </w:r>
+            </w:hyperlink>
+          </w:p>
+          <w:p>
+            <w:pPr>
+              <w:rPr>
+                <w:rFonts w:ascii="Lora" w:hAnsi="Lora"/>
+                <w:sz w:val="20"/>
+                <w:szCs w:val="20"/>
+              </w:rPr>
+            </w:pPr>
+            <w:hyperlink r:id="rId10" w:history="1">
               <w:r>
                 <w:rPr>
                   <w:rStyle w:val="Hyperlink"/>
                   <w:rFonts w:ascii="Lora" w:hAnsi="Lora"/>
+                  <w:sz w:val="20"/>
+                  <w:szCs w:val="20"/>
                 </w:rPr>
-                <w:t>hei@binghamton.edu</w:t>
+                <w:t>heizihan050418@gmail.com</w:t>
               </w:r>
             </w:hyperlink>
           </w:p>
@@ -532,10 +544,10 @@
                           <pic:cNvPicPr/>
                         </pic:nvPicPr>
                         <pic:blipFill>
-                          <a:blip r:embed="rId10">
+                          <a:blip r:embed="rId11">
                             <a:extLst>
                               <a:ext uri="{96DAC541-7B7A-43D3-8B79-37D633B846F1}">
-                                <asvg:svgBlip xmlns:asvg="http://schemas.microsoft.com/office/drawing/2016/SVG/main" r:embed="rId11"/>
+                                <asvg:svgBlip xmlns:asvg="http://schemas.microsoft.com/office/drawing/2016/SVG/main" r:embed="rId12"/>
                               </a:ext>
                             </a:extLst>
                           </a:blip>
@@ -642,7 +654,7 @@
               </w:rPr>
               <w:fldChar w:fldCharType="end"/>
             </w:r>
-            <w:hyperlink r:id="rId12" w:history="1">
+            <w:hyperlink r:id="rId13" w:history="1">
               <w:r>
                 <w:rPr>
                   <w:rStyle w:val="Hyperlink"/>
@@ -671,7 +683,7 @@
                 <w:szCs w:val="20"/>
               </w:rPr>
             </w:pPr>
-            <w:hyperlink r:id="rId13" w:history="1">
+            <w:hyperlink r:id="rId14" w:history="1">
               <w:r>
                 <w:rPr>
                   <w:rStyle w:val="Hyperlink"/>
@@ -1216,6 +1228,47 @@
                 <w:szCs w:val="21"/>
                 <w:lang w:eastAsia="zh-TW"/>
               </w:rPr>
+              <w:t xml:space="preserve"> |</w:t>
+            </w:r>
+            <w:r>
+              <w:rPr>
+                <w:rFonts w:ascii="Lora" w:eastAsia="Times New Roman" w:hAnsi="Lora"/>
+                <w:b/>
+                <w:i/>
+                <w:iCs/>
+                <w:color w:val="2D4239"/>
+                <w:sz w:val="21"/>
+                <w:szCs w:val="21"/>
+                <w:lang w:eastAsia="zh-TW"/>
+              </w:rPr>
+              <w:t xml:space="preserve"> </w:t>
+            </w:r>
+            <w:r>
+              <w:rPr>
+                <w:rFonts w:ascii="Lora" w:eastAsia="Times New Roman" w:hAnsi="Lora"/>
+                <w:b/>
+                <w:bCs/>
+                <w:i/>
+                <w:iCs/>
+                <w:color w:val="2D4239"/>
+                <w:sz w:val="21"/>
+                <w:szCs w:val="21"/>
+                <w:lang w:eastAsia="zh-TW"/>
+              </w:rPr>
+              <w:t>NSF REU Research Stipend</w:t>
+            </w:r>
+            <w:r>
+              <w:rPr>
+                <w:rFonts w:ascii="Lora" w:eastAsia="Times New Roman" w:hAnsi="Lora"/>
+                <w:b/>
+                <w:bCs/>
+                <w:i/>
+                <w:iCs/>
+                <w:color w:val="2D4239"/>
+                <w:sz w:val="21"/>
+                <w:szCs w:val="21"/>
+                <w:lang w:eastAsia="zh-TW"/>
+              </w:rPr>
               <w:t xml:space="preserve"> | </w:t>
             </w:r>
             <w:r>
@@ -1269,7 +1322,73 @@
                 <w:szCs w:val="20"/>
                 <w:lang w:eastAsia="zh-TW"/>
               </w:rPr>
-              <w:t xml:space="preserve">Reproduce and validate RNA-seq and single-cell RNA-seq preprocessing workflows, including quality control, normalization, gene filtering, and highly variable gene selection. </w:t>
+              <w:t>Contribute 10 hrs/week to chemo-immunotherapy biomarker discovery by reproducing RNA-</w:t>
+            </w:r>
+            <w:proofErr w:type="spellStart"/>
+            <w:r>
+              <w:rPr>
+                <w:rFonts w:ascii="Roboto" w:eastAsia="Times New Roman" w:hAnsi="Roboto"/>
+                <w:bCs/>
+                <w:sz w:val="20"/>
+                <w:szCs w:val="20"/>
+                <w:lang w:eastAsia="zh-TW"/>
+              </w:rPr>
+              <w:t>seq</w:t>
+            </w:r>
+            <w:proofErr w:type="spellEnd"/>
+            <w:r>
+              <w:rPr>
+                <w:rFonts w:ascii="Roboto" w:eastAsia="Times New Roman" w:hAnsi="Roboto"/>
+                <w:bCs/>
+                <w:sz w:val="20"/>
+                <w:szCs w:val="20"/>
+                <w:lang w:eastAsia="zh-TW"/>
+              </w:rPr>
+              <w:t xml:space="preserve"> and </w:t>
+            </w:r>
+            <w:proofErr w:type="spellStart"/>
+            <w:r>
+              <w:rPr>
+                <w:rFonts w:ascii="Roboto" w:eastAsia="Times New Roman" w:hAnsi="Roboto"/>
+                <w:bCs/>
+                <w:sz w:val="20"/>
+                <w:szCs w:val="20"/>
+                <w:lang w:eastAsia="zh-TW"/>
+              </w:rPr>
+              <w:t>scRNA-seq</w:t>
+            </w:r>
+            <w:proofErr w:type="spellEnd"/>
+            <w:r>
+              <w:rPr>
+                <w:rFonts w:ascii="Roboto" w:eastAsia="Times New Roman" w:hAnsi="Roboto"/>
+                <w:bCs/>
+                <w:sz w:val="20"/>
+                <w:szCs w:val="20"/>
+                <w:lang w:eastAsia="zh-TW"/>
+              </w:rPr>
+              <w:t xml:space="preserve"> preprocessing, clustering TCR expansion with K-means, and </w:t>
+            </w:r>
+            <w:proofErr w:type="spellStart"/>
+            <w:r>
+              <w:rPr>
+                <w:rFonts w:ascii="Roboto" w:eastAsia="Times New Roman" w:hAnsi="Roboto"/>
+                <w:bCs/>
+                <w:sz w:val="20"/>
+                <w:szCs w:val="20"/>
+                <w:lang w:eastAsia="zh-TW"/>
+              </w:rPr>
+              <w:t>analyzing</w:t>
+            </w:r>
+            <w:proofErr w:type="spellEnd"/>
+            <w:r>
+              <w:rPr>
+                <w:rFonts w:ascii="Roboto" w:eastAsia="Times New Roman" w:hAnsi="Roboto"/>
+                <w:bCs/>
+                <w:sz w:val="20"/>
+                <w:szCs w:val="20"/>
+                <w:lang w:eastAsia="zh-TW"/>
+              </w:rPr>
+              <w:t xml:space="preserve"> treatment-response signatures.</w:t>
             </w:r>
           </w:p>
           <w:p>
@@ -1283,346 +1402,55 @@
               <w:ind w:left="357" w:right="567" w:hanging="357"/>
               <w:contextualSpacing w:val="0"/>
               <w:rPr>
-                <w:rFonts w:ascii="Lora" w:eastAsia="Times New Roman" w:hAnsi="Lora"/>
-                <w:b/>
-                <w:sz w:val="21"/>
-                <w:szCs w:val="21"/>
-                <w:lang w:eastAsia="zh-TW"/>
-              </w:rPr>
-            </w:pPr>
-            <w:r>
-              <w:rPr>
-                <w:rFonts w:ascii="Roboto" w:eastAsia="Times New Roman" w:hAnsi="Roboto"/>
-                <w:bCs/>
-                <w:sz w:val="20"/>
-                <w:szCs w:val="20"/>
-                <w:lang w:eastAsia="zh-TW"/>
-              </w:rPr>
-              <w:t xml:space="preserve">Apply NMF, differential expression analysis, cross-study comparisons, and GSEA to identify and validate treatment-response biomarkers and biological pathways (manuscript in preparation). </w:t>
-            </w:r>
-          </w:p>
-        </w:tc>
-      </w:tr>
-      <w:tr>
-        <w:trPr>
-          <w:trHeight w:val="144"/>
-        </w:trPr>
-        <w:tc>
-          <w:tcPr>
-            <w:tcW w:w="1274" w:type="dxa"/>
-            <w:gridSpan w:val="2"/>
-            <w:tcMar>
-              <w:left w:w="57" w:type="dxa"/>
-            </w:tcMar>
-          </w:tcPr>
-          <w:p>
-            <w:pPr>
-              <w:rPr>
-                <w:rFonts w:ascii="Lora" w:eastAsia="Times New Roman" w:hAnsi="Lora"/>
-                <w:bCs/>
-                <w:sz w:val="21"/>
-                <w:szCs w:val="21"/>
-                <w:lang w:eastAsia="zh-TW"/>
-              </w:rPr>
-            </w:pPr>
-          </w:p>
-        </w:tc>
-        <w:tc>
-          <w:tcPr>
-            <w:tcW w:w="578" w:type="dxa"/>
-          </w:tcPr>
-          <w:p>
-            <w:pPr>
-              <w:rPr>
-                <w:rFonts w:ascii="Lora" w:eastAsia="Times New Roman" w:hAnsi="Lora"/>
-                <w:b/>
-                <w:sz w:val="21"/>
-                <w:szCs w:val="21"/>
-                <w:lang w:eastAsia="zh-TW"/>
-              </w:rPr>
-            </w:pPr>
-          </w:p>
-        </w:tc>
-        <w:tc>
-          <w:tcPr>
-            <w:tcW w:w="9655" w:type="dxa"/>
-            <w:gridSpan w:val="6"/>
-          </w:tcPr>
-          <w:p>
-            <w:pPr>
-              <w:rPr>
-                <w:rFonts w:ascii="Lora" w:eastAsia="Times New Roman" w:hAnsi="Lora"/>
-                <w:bCs/>
-                <w:sz w:val="21"/>
-                <w:szCs w:val="21"/>
-                <w:lang w:eastAsia="zh-TW"/>
-              </w:rPr>
-            </w:pPr>
-          </w:p>
-        </w:tc>
-      </w:tr>
-      <w:tr>
-        <w:trPr>
-          <w:trHeight w:val="144"/>
-        </w:trPr>
-        <w:tc>
-          <w:tcPr>
-            <w:tcW w:w="1274" w:type="dxa"/>
-            <w:gridSpan w:val="2"/>
-            <w:tcMar>
-              <w:left w:w="57" w:type="dxa"/>
-            </w:tcMar>
-          </w:tcPr>
-          <w:p>
-            <w:pPr>
-              <w:ind w:left="79"/>
-              <w:rPr>
-                <w:rFonts w:ascii="Roboto" w:hAnsi="Roboto" w:cs="Times New Roman (Body CS)"/>
-                <w:sz w:val="20"/>
-                <w:szCs w:val="20"/>
-              </w:rPr>
-            </w:pPr>
-            <w:r>
-              <w:rPr>
-                <w:rFonts w:ascii="Roboto" w:hAnsi="Roboto" w:cs="Times New Roman (Body CS)"/>
-                <w:sz w:val="20"/>
-                <w:szCs w:val="20"/>
-              </w:rPr>
-              <w:t>AUG</w:t>
-            </w:r>
-            <w:r>
-              <w:rPr>
-                <w:rFonts w:ascii="Roboto" w:hAnsi="Roboto" w:cs="Times New Roman (Body CS)"/>
-                <w:sz w:val="20"/>
-                <w:szCs w:val="20"/>
-              </w:rPr>
-              <w:t xml:space="preserve"> 20</w:t>
-            </w:r>
-            <w:r>
-              <w:rPr>
-                <w:rFonts w:ascii="Roboto" w:hAnsi="Roboto" w:cs="Times New Roman (Body CS)"/>
-                <w:sz w:val="20"/>
-                <w:szCs w:val="20"/>
-              </w:rPr>
-              <w:t>25</w:t>
-            </w:r>
-            <w:r>
-              <w:rPr>
-                <w:rFonts w:ascii="Roboto" w:hAnsi="Roboto" w:cs="Times New Roman (Body CS)"/>
-                <w:sz w:val="20"/>
-                <w:szCs w:val="20"/>
-              </w:rPr>
-              <w:t xml:space="preserve"> - </w:t>
-            </w:r>
-            <w:r>
-              <w:rPr>
-                <w:rFonts w:ascii="Roboto" w:hAnsi="Roboto" w:cs="Times New Roman (Body CS)"/>
-                <w:sz w:val="20"/>
-                <w:szCs w:val="20"/>
-              </w:rPr>
-              <w:t>PRESENT</w:t>
-            </w:r>
-          </w:p>
-        </w:tc>
-        <w:tc>
-          <w:tcPr>
-            <w:tcW w:w="578" w:type="dxa"/>
-            <w:tcBorders>
-              <w:right w:val="single" w:sz="4" w:space="0" w:color="000000"/>
-            </w:tcBorders>
-          </w:tcPr>
-          <w:p>
-            <w:pPr>
-              <w:rPr>
-                <w:rFonts w:ascii="Lora" w:eastAsia="Times New Roman" w:hAnsi="Lora"/>
-                <w:b/>
-                <w:sz w:val="21"/>
-                <w:szCs w:val="21"/>
-                <w:lang w:eastAsia="zh-TW"/>
-              </w:rPr>
-            </w:pPr>
-          </w:p>
-        </w:tc>
-        <w:tc>
-          <w:tcPr>
-            <w:tcW w:w="9655" w:type="dxa"/>
-            <w:gridSpan w:val="6"/>
-            <w:tcBorders>
-              <w:left w:val="single" w:sz="4" w:space="0" w:color="000000"/>
-            </w:tcBorders>
-          </w:tcPr>
-          <w:p>
-            <w:pPr>
-              <w:rPr>
-                <w:rFonts w:ascii="Roboto" w:hAnsi="Roboto"/>
-                <w:b/>
-                <w:bCs/>
-                <w:sz w:val="26"/>
-                <w:szCs w:val="26"/>
-              </w:rPr>
-            </w:pPr>
-            <w:r>
-              <w:rPr>
-                <w:rFonts w:ascii="Roboto" w:hAnsi="Roboto"/>
-                <w:b/>
-                <w:bCs/>
-                <w:sz w:val="26"/>
-                <w:szCs w:val="26"/>
-              </w:rPr>
-              <w:t>Machine Learning for Health Information Avoidance</w:t>
-            </w:r>
-          </w:p>
-          <w:p>
-            <w:pPr>
-              <w:rPr>
-                <w:rFonts w:ascii="Lora" w:eastAsia="Times New Roman" w:hAnsi="Lora"/>
-                <w:b/>
-                <w:color w:val="2D4239"/>
-                <w:sz w:val="21"/>
-                <w:szCs w:val="21"/>
-                <w:lang w:eastAsia="zh-TW"/>
-              </w:rPr>
-            </w:pPr>
-            <w:r>
-              <w:rPr>
-                <w:rFonts w:ascii="Lora" w:eastAsia="Times New Roman" w:hAnsi="Lora"/>
-                <w:b/>
-                <w:i/>
-                <w:iCs/>
-                <w:color w:val="2D4239"/>
-                <w:sz w:val="21"/>
-                <w:szCs w:val="21"/>
-                <w:lang w:eastAsia="zh-TW"/>
-              </w:rPr>
-              <w:t>Independent Study with Dr. Heather Orom</w:t>
-            </w:r>
-            <w:r>
-              <w:rPr>
-                <w:rFonts w:ascii="Lora" w:eastAsia="Times New Roman" w:hAnsi="Lora"/>
-                <w:b/>
-                <w:i/>
-                <w:iCs/>
-                <w:color w:val="2D4239"/>
-                <w:sz w:val="21"/>
-                <w:szCs w:val="21"/>
-                <w:lang w:eastAsia="zh-TW"/>
-              </w:rPr>
-              <w:t xml:space="preserve">, </w:t>
-            </w:r>
-            <w:r>
-              <w:rPr>
-                <w:rFonts w:ascii="Lora" w:eastAsia="Times New Roman" w:hAnsi="Lora"/>
-                <w:b/>
-                <w:i/>
-                <w:iCs/>
-                <w:color w:val="2D4239"/>
-                <w:sz w:val="21"/>
-                <w:szCs w:val="21"/>
-                <w:lang w:eastAsia="zh-TW"/>
-              </w:rPr>
-              <w:t>Dr. Shane McCarty</w:t>
-            </w:r>
-            <w:r>
-              <w:rPr>
-                <w:rFonts w:ascii="Lora" w:eastAsia="Times New Roman" w:hAnsi="Lora"/>
-                <w:b/>
-                <w:i/>
-                <w:iCs/>
-                <w:color w:val="2D4239"/>
-                <w:sz w:val="21"/>
-                <w:szCs w:val="21"/>
-                <w:lang w:eastAsia="zh-TW"/>
-              </w:rPr>
-              <w:t>, and Dr.</w:t>
-            </w:r>
-            <w:r>
-              <w:rPr>
-                <w:rFonts w:ascii="Lora" w:eastAsia="Times New Roman" w:hAnsi="Lora"/>
-                <w:b/>
-                <w:i/>
-                <w:iCs/>
-                <w:color w:val="2D4239"/>
-                <w:sz w:val="21"/>
-                <w:szCs w:val="21"/>
-                <w:lang w:eastAsia="zh-TW"/>
-              </w:rPr>
-              <w:t xml:space="preserve"> </w:t>
-            </w:r>
-            <w:r>
-              <w:rPr>
-                <w:rFonts w:ascii="Lora" w:eastAsia="Times New Roman" w:hAnsi="Lora"/>
-                <w:b/>
-                <w:i/>
-                <w:iCs/>
-                <w:color w:val="2D4239"/>
-                <w:sz w:val="21"/>
-                <w:szCs w:val="21"/>
-                <w:lang w:eastAsia="zh-TW"/>
-              </w:rPr>
-              <w:t>Kargin</w:t>
-            </w:r>
-            <w:r>
-              <w:rPr>
-                <w:rFonts w:ascii="Lora" w:eastAsia="Times New Roman" w:hAnsi="Lora"/>
-                <w:b/>
-                <w:i/>
-                <w:iCs/>
-                <w:color w:val="2D4239"/>
-                <w:sz w:val="21"/>
-                <w:szCs w:val="21"/>
-                <w:lang w:eastAsia="zh-TW"/>
-              </w:rPr>
-              <w:t xml:space="preserve"> Vladis</w:t>
-            </w:r>
-            <w:r>
-              <w:rPr>
-                <w:rFonts w:ascii="Lora" w:eastAsia="Times New Roman" w:hAnsi="Lora"/>
-                <w:b/>
-                <w:i/>
-                <w:iCs/>
-                <w:color w:val="2D4239"/>
-                <w:sz w:val="21"/>
-                <w:szCs w:val="21"/>
-                <w:lang w:eastAsia="zh-TW"/>
-              </w:rPr>
-              <w:t xml:space="preserve">lav </w:t>
-            </w:r>
-            <w:r>
-              <w:rPr>
-                <w:rFonts w:ascii="Lora" w:eastAsia="Times New Roman" w:hAnsi="Lora"/>
-                <w:b/>
-                <w:i/>
-                <w:iCs/>
-                <w:color w:val="2D4239"/>
-                <w:sz w:val="21"/>
-                <w:szCs w:val="21"/>
-                <w:lang w:eastAsia="zh-TW"/>
-              </w:rPr>
-              <w:t>| Binghamton University</w:t>
-            </w:r>
-            <w:r>
-              <w:rPr>
-                <w:rFonts w:ascii="Lora" w:eastAsia="Times New Roman" w:hAnsi="Lora"/>
-                <w:b/>
-                <w:color w:val="2D4239"/>
-                <w:sz w:val="21"/>
-                <w:szCs w:val="21"/>
-                <w:lang w:eastAsia="zh-TW"/>
-              </w:rPr>
-              <w:t xml:space="preserve"> </w:t>
-            </w:r>
-          </w:p>
-          <w:p>
-            <w:pPr>
-              <w:rPr>
-                <w:rFonts w:ascii="Lora" w:eastAsia="Times New Roman" w:hAnsi="Lora"/>
-                <w:b/>
-                <w:color w:val="2D4239"/>
-                <w:sz w:val="21"/>
-                <w:szCs w:val="21"/>
-                <w:lang w:eastAsia="zh-TW"/>
-              </w:rPr>
-            </w:pPr>
+                <w:rFonts w:ascii="Roboto" w:eastAsia="Times New Roman" w:hAnsi="Roboto"/>
+                <w:bCs/>
+                <w:sz w:val="20"/>
+                <w:szCs w:val="20"/>
+                <w:lang w:eastAsia="zh-TW"/>
+              </w:rPr>
+            </w:pPr>
+            <w:r>
+              <w:rPr>
+                <w:rFonts w:ascii="Roboto" w:eastAsia="Times New Roman" w:hAnsi="Roboto"/>
+                <w:bCs/>
+                <w:sz w:val="20"/>
+                <w:szCs w:val="20"/>
+                <w:lang w:eastAsia="zh-TW"/>
+              </w:rPr>
+              <w:t>Transform and validate single-cell RNA-</w:t>
+            </w:r>
+            <w:proofErr w:type="spellStart"/>
+            <w:r>
+              <w:rPr>
+                <w:rFonts w:ascii="Roboto" w:eastAsia="Times New Roman" w:hAnsi="Roboto"/>
+                <w:bCs/>
+                <w:sz w:val="20"/>
+                <w:szCs w:val="20"/>
+                <w:lang w:eastAsia="zh-TW"/>
+              </w:rPr>
+              <w:t>seq</w:t>
+            </w:r>
+            <w:proofErr w:type="spellEnd"/>
+            <w:r>
+              <w:rPr>
+                <w:rFonts w:ascii="Roboto" w:eastAsia="Times New Roman" w:hAnsi="Roboto"/>
+                <w:bCs/>
+                <w:sz w:val="20"/>
+                <w:szCs w:val="20"/>
+                <w:lang w:eastAsia="zh-TW"/>
+              </w:rPr>
+              <w:t xml:space="preserve"> data through quality control, normalization, gene filtering, and highly variable gene selection</w:t>
+            </w:r>
+            <w:r>
+              <w:rPr>
+                <w:rFonts w:ascii="Roboto" w:eastAsia="Times New Roman" w:hAnsi="Roboto"/>
+                <w:bCs/>
+                <w:sz w:val="20"/>
+                <w:szCs w:val="20"/>
+                <w:lang w:eastAsia="zh-TW"/>
+              </w:rPr>
+              <w:t xml:space="preserve">. </w:t>
+            </w:r>
           </w:p>
           <w:p>
             <w:pPr>
@@ -1635,33 +1463,454 @@
               <w:ind w:left="357" w:right="567" w:hanging="357"/>
               <w:contextualSpacing w:val="0"/>
               <w:rPr>
-                <w:rFonts w:ascii="Roboto" w:eastAsia="Times New Roman" w:hAnsi="Roboto"/>
-                <w:bCs/>
-                <w:sz w:val="20"/>
-                <w:szCs w:val="20"/>
-                <w:lang w:eastAsia="zh-TW"/>
-              </w:rPr>
-            </w:pPr>
-            <w:r>
-              <w:rPr>
-                <w:rFonts w:ascii="Roboto" w:eastAsia="Times New Roman" w:hAnsi="Roboto"/>
-                <w:bCs/>
-                <w:sz w:val="20"/>
-                <w:szCs w:val="20"/>
-                <w:lang w:eastAsia="zh-TW"/>
-              </w:rPr>
-              <w:t>Clean, recode, and score sociodemographic, psychological, health behavior, and media-use variables in R</w:t>
-            </w:r>
-            <w:r>
-              <w:rPr>
-                <w:rFonts w:ascii="Roboto" w:eastAsia="Times New Roman" w:hAnsi="Roboto"/>
-                <w:bCs/>
-                <w:sz w:val="20"/>
-                <w:szCs w:val="20"/>
-                <w:lang w:eastAsia="zh-TW"/>
-              </w:rPr>
-              <w:t xml:space="preserve">. </w:t>
-            </w:r>
+                <w:rFonts w:ascii="Lora" w:eastAsia="Times New Roman" w:hAnsi="Lora"/>
+                <w:b/>
+                <w:sz w:val="21"/>
+                <w:szCs w:val="21"/>
+                <w:lang w:eastAsia="zh-TW"/>
+              </w:rPr>
+            </w:pPr>
+            <w:r>
+              <w:rPr>
+                <w:rFonts w:ascii="Roboto" w:eastAsia="Times New Roman" w:hAnsi="Roboto"/>
+                <w:bCs/>
+                <w:sz w:val="20"/>
+                <w:szCs w:val="20"/>
+                <w:lang w:eastAsia="zh-TW"/>
+              </w:rPr>
+              <w:t>Perform</w:t>
+            </w:r>
+            <w:r>
+              <w:rPr>
+                <w:rFonts w:ascii="Roboto" w:eastAsia="Times New Roman" w:hAnsi="Roboto"/>
+                <w:bCs/>
+                <w:sz w:val="20"/>
+                <w:szCs w:val="20"/>
+                <w:lang w:eastAsia="zh-TW"/>
+              </w:rPr>
+              <w:t xml:space="preserve"> differential expression analysis, cross-study comparisons, and </w:t>
+            </w:r>
+            <w:r>
+              <w:rPr>
+                <w:rFonts w:ascii="Roboto" w:eastAsia="Times New Roman" w:hAnsi="Roboto"/>
+                <w:bCs/>
+                <w:sz w:val="20"/>
+                <w:szCs w:val="20"/>
+                <w:lang w:eastAsia="zh-TW"/>
+              </w:rPr>
+              <w:t>Gene Set Enrichment Analysis</w:t>
+            </w:r>
+            <w:r>
+              <w:rPr>
+                <w:rFonts w:ascii="Roboto" w:eastAsia="Times New Roman" w:hAnsi="Roboto"/>
+                <w:bCs/>
+                <w:sz w:val="20"/>
+                <w:szCs w:val="20"/>
+                <w:lang w:eastAsia="zh-TW"/>
+              </w:rPr>
+              <w:t xml:space="preserve"> </w:t>
+            </w:r>
+            <w:r>
+              <w:rPr>
+                <w:rFonts w:ascii="Roboto" w:eastAsia="Times New Roman" w:hAnsi="Roboto"/>
+                <w:bCs/>
+                <w:sz w:val="20"/>
+                <w:szCs w:val="20"/>
+                <w:lang w:eastAsia="zh-TW"/>
+              </w:rPr>
+              <w:t xml:space="preserve">to identify and validate treatment-response biomarkers and biological pathways (manuscript in preparation). </w:t>
+            </w:r>
+          </w:p>
+        </w:tc>
+      </w:tr>
+      <w:tr>
+        <w:trPr>
+          <w:trHeight w:val="144"/>
+        </w:trPr>
+        <w:tc>
+          <w:tcPr>
+            <w:tcW w:w="1274" w:type="dxa"/>
+            <w:gridSpan w:val="2"/>
+            <w:tcMar>
+              <w:left w:w="57" w:type="dxa"/>
+            </w:tcMar>
+          </w:tcPr>
+          <w:p>
+            <w:pPr>
+              <w:rPr>
+                <w:rFonts w:ascii="Lora" w:eastAsia="Times New Roman" w:hAnsi="Lora"/>
+                <w:bCs/>
+                <w:sz w:val="21"/>
+                <w:szCs w:val="21"/>
+                <w:lang w:eastAsia="zh-TW"/>
+              </w:rPr>
+            </w:pPr>
+          </w:p>
+        </w:tc>
+        <w:tc>
+          <w:tcPr>
+            <w:tcW w:w="578" w:type="dxa"/>
+          </w:tcPr>
+          <w:p>
+            <w:pPr>
+              <w:rPr>
+                <w:rFonts w:ascii="Lora" w:eastAsia="Times New Roman" w:hAnsi="Lora"/>
+                <w:b/>
+                <w:sz w:val="21"/>
+                <w:szCs w:val="21"/>
+                <w:lang w:eastAsia="zh-TW"/>
+              </w:rPr>
+            </w:pPr>
+          </w:p>
+        </w:tc>
+        <w:tc>
+          <w:tcPr>
+            <w:tcW w:w="9655" w:type="dxa"/>
+            <w:gridSpan w:val="6"/>
+          </w:tcPr>
+          <w:p>
+            <w:pPr>
+              <w:rPr>
+                <w:rFonts w:ascii="Lora" w:eastAsia="Times New Roman" w:hAnsi="Lora"/>
+                <w:bCs/>
+                <w:sz w:val="21"/>
+                <w:szCs w:val="21"/>
+                <w:lang w:eastAsia="zh-TW"/>
+              </w:rPr>
+            </w:pPr>
+          </w:p>
+        </w:tc>
+      </w:tr>
+      <w:tr>
+        <w:trPr>
+          <w:trHeight w:val="144"/>
+        </w:trPr>
+        <w:tc>
+          <w:tcPr>
+            <w:tcW w:w="1274" w:type="dxa"/>
+            <w:gridSpan w:val="2"/>
+            <w:tcMar>
+              <w:left w:w="57" w:type="dxa"/>
+            </w:tcMar>
+          </w:tcPr>
+          <w:p>
+            <w:pPr>
+              <w:ind w:left="79"/>
+              <w:rPr>
+                <w:rFonts w:ascii="Roboto" w:hAnsi="Roboto" w:cs="Times New Roman (Body CS)"/>
+                <w:sz w:val="20"/>
+                <w:szCs w:val="20"/>
+              </w:rPr>
+            </w:pPr>
+            <w:r>
+              <w:rPr>
+                <w:rFonts w:ascii="Roboto" w:hAnsi="Roboto" w:cs="Times New Roman (Body CS)"/>
+                <w:sz w:val="20"/>
+                <w:szCs w:val="20"/>
+              </w:rPr>
+              <w:t>AUG</w:t>
+            </w:r>
+            <w:r>
+              <w:rPr>
+                <w:rFonts w:ascii="Roboto" w:hAnsi="Roboto" w:cs="Times New Roman (Body CS)"/>
+                <w:sz w:val="20"/>
+                <w:szCs w:val="20"/>
+              </w:rPr>
+              <w:t xml:space="preserve"> 20</w:t>
+            </w:r>
+            <w:r>
+              <w:rPr>
+                <w:rFonts w:ascii="Roboto" w:hAnsi="Roboto" w:cs="Times New Roman (Body CS)"/>
+                <w:sz w:val="20"/>
+                <w:szCs w:val="20"/>
+              </w:rPr>
+              <w:t>25</w:t>
+            </w:r>
+            <w:r>
+              <w:rPr>
+                <w:rFonts w:ascii="Roboto" w:hAnsi="Roboto" w:cs="Times New Roman (Body CS)"/>
+                <w:sz w:val="20"/>
+                <w:szCs w:val="20"/>
+              </w:rPr>
+              <w:t xml:space="preserve"> - </w:t>
+            </w:r>
+            <w:r>
+              <w:rPr>
+                <w:rFonts w:ascii="Roboto" w:hAnsi="Roboto" w:cs="Times New Roman (Body CS)"/>
+                <w:sz w:val="20"/>
+                <w:szCs w:val="20"/>
+              </w:rPr>
+              <w:t>PRESENT</w:t>
+            </w:r>
+          </w:p>
+        </w:tc>
+        <w:tc>
+          <w:tcPr>
+            <w:tcW w:w="578" w:type="dxa"/>
+            <w:tcBorders>
+              <w:right w:val="single" w:sz="4" w:space="0" w:color="000000"/>
+            </w:tcBorders>
+          </w:tcPr>
+          <w:p>
+            <w:pPr>
+              <w:rPr>
+                <w:rFonts w:ascii="Lora" w:eastAsia="Times New Roman" w:hAnsi="Lora"/>
+                <w:b/>
+                <w:sz w:val="21"/>
+                <w:szCs w:val="21"/>
+                <w:lang w:eastAsia="zh-TW"/>
+              </w:rPr>
+            </w:pPr>
+          </w:p>
+        </w:tc>
+        <w:tc>
+          <w:tcPr>
+            <w:tcW w:w="9655" w:type="dxa"/>
+            <w:gridSpan w:val="6"/>
+            <w:tcBorders>
+              <w:left w:val="single" w:sz="4" w:space="0" w:color="000000"/>
+            </w:tcBorders>
+          </w:tcPr>
+          <w:p>
+            <w:pPr>
+              <w:rPr>
+                <w:rFonts w:ascii="Roboto" w:hAnsi="Roboto"/>
+                <w:b/>
+                <w:bCs/>
+                <w:sz w:val="26"/>
+                <w:szCs w:val="26"/>
+              </w:rPr>
+            </w:pPr>
+            <w:r>
+              <w:rPr>
+                <w:rFonts w:ascii="Roboto" w:hAnsi="Roboto"/>
+                <w:b/>
+                <w:bCs/>
+                <w:sz w:val="26"/>
+                <w:szCs w:val="26"/>
+              </w:rPr>
+              <w:t>Predicting</w:t>
+            </w:r>
+            <w:r>
+              <w:rPr>
+                <w:rFonts w:ascii="Roboto" w:hAnsi="Roboto"/>
+                <w:b/>
+                <w:bCs/>
+                <w:sz w:val="26"/>
+                <w:szCs w:val="26"/>
+              </w:rPr>
+              <w:t xml:space="preserve"> Health Information Avoidance</w:t>
+            </w:r>
+            <w:r>
+              <w:rPr>
+                <w:rFonts w:ascii="Roboto" w:hAnsi="Roboto"/>
+                <w:b/>
+                <w:bCs/>
+                <w:sz w:val="26"/>
+                <w:szCs w:val="26"/>
+              </w:rPr>
+              <w:t xml:space="preserve"> in </w:t>
+            </w:r>
+            <w:r>
+              <w:rPr>
+                <w:rFonts w:ascii="Roboto" w:hAnsi="Roboto"/>
+                <w:b/>
+                <w:bCs/>
+                <w:sz w:val="26"/>
+                <w:szCs w:val="26"/>
+              </w:rPr>
+              <w:t>Colorectal Cancer</w:t>
+            </w:r>
+            <w:r>
+              <w:rPr>
+                <w:rFonts w:ascii="Roboto" w:hAnsi="Roboto"/>
+                <w:b/>
+                <w:bCs/>
+                <w:sz w:val="26"/>
+                <w:szCs w:val="26"/>
+              </w:rPr>
+              <w:tab/>
+            </w:r>
+          </w:p>
+          <w:p>
+            <w:pPr>
+              <w:rPr>
+                <w:rFonts w:ascii="Lora" w:eastAsia="Times New Roman" w:hAnsi="Lora"/>
+                <w:b/>
+                <w:color w:val="2D4239"/>
+                <w:sz w:val="21"/>
+                <w:szCs w:val="21"/>
+                <w:lang w:eastAsia="zh-TW"/>
+              </w:rPr>
+            </w:pPr>
+            <w:r>
+              <w:rPr>
+                <w:rFonts w:ascii="Lora" w:eastAsia="Times New Roman" w:hAnsi="Lora"/>
+                <w:b/>
+                <w:i/>
+                <w:iCs/>
+                <w:color w:val="2D4239"/>
+                <w:sz w:val="21"/>
+                <w:szCs w:val="21"/>
+                <w:lang w:eastAsia="zh-TW"/>
+              </w:rPr>
+              <w:t xml:space="preserve">Independent Study with Dr. Heather </w:t>
+            </w:r>
+            <w:proofErr w:type="spellStart"/>
+            <w:r>
+              <w:rPr>
+                <w:rFonts w:ascii="Lora" w:eastAsia="Times New Roman" w:hAnsi="Lora"/>
+                <w:b/>
+                <w:i/>
+                <w:iCs/>
+                <w:color w:val="2D4239"/>
+                <w:sz w:val="21"/>
+                <w:szCs w:val="21"/>
+                <w:lang w:eastAsia="zh-TW"/>
+              </w:rPr>
+              <w:t>Orom</w:t>
+            </w:r>
+            <w:proofErr w:type="spellEnd"/>
+            <w:r>
+              <w:rPr>
+                <w:rFonts w:ascii="Lora" w:eastAsia="Times New Roman" w:hAnsi="Lora"/>
+                <w:b/>
+                <w:i/>
+                <w:iCs/>
+                <w:color w:val="2D4239"/>
+                <w:sz w:val="21"/>
+                <w:szCs w:val="21"/>
+                <w:lang w:eastAsia="zh-TW"/>
+              </w:rPr>
+              <w:t xml:space="preserve"> (University at Buffalo)</w:t>
+            </w:r>
+            <w:r>
+              <w:rPr>
+                <w:rFonts w:ascii="Lora" w:eastAsia="Times New Roman" w:hAnsi="Lora"/>
+                <w:b/>
+                <w:i/>
+                <w:iCs/>
+                <w:color w:val="2D4239"/>
+                <w:sz w:val="21"/>
+                <w:szCs w:val="21"/>
+                <w:lang w:eastAsia="zh-TW"/>
+              </w:rPr>
+              <w:t xml:space="preserve">, </w:t>
+            </w:r>
+            <w:r>
+              <w:rPr>
+                <w:rFonts w:ascii="Lora" w:eastAsia="Times New Roman" w:hAnsi="Lora"/>
+                <w:b/>
+                <w:i/>
+                <w:iCs/>
+                <w:color w:val="2D4239"/>
+                <w:sz w:val="21"/>
+                <w:szCs w:val="21"/>
+                <w:lang w:eastAsia="zh-TW"/>
+              </w:rPr>
+              <w:t>Dr. Shane McCarty</w:t>
+            </w:r>
+            <w:r>
+              <w:rPr>
+                <w:rFonts w:ascii="Lora" w:eastAsia="Times New Roman" w:hAnsi="Lora"/>
+                <w:b/>
+                <w:i/>
+                <w:iCs/>
+                <w:color w:val="2D4239"/>
+                <w:sz w:val="21"/>
+                <w:szCs w:val="21"/>
+                <w:lang w:eastAsia="zh-TW"/>
+              </w:rPr>
+              <w:t>, and Dr.</w:t>
+            </w:r>
+            <w:r>
+              <w:rPr>
+                <w:rFonts w:ascii="Lora" w:eastAsia="Times New Roman" w:hAnsi="Lora"/>
+                <w:b/>
+                <w:i/>
+                <w:iCs/>
+                <w:color w:val="2D4239"/>
+                <w:sz w:val="21"/>
+                <w:szCs w:val="21"/>
+                <w:lang w:eastAsia="zh-TW"/>
+              </w:rPr>
+              <w:t xml:space="preserve"> </w:t>
+            </w:r>
+            <w:r>
+              <w:rPr>
+                <w:rFonts w:ascii="Lora" w:eastAsia="Times New Roman" w:hAnsi="Lora"/>
+                <w:b/>
+                <w:i/>
+                <w:iCs/>
+                <w:color w:val="2D4239"/>
+                <w:sz w:val="21"/>
+                <w:szCs w:val="21"/>
+                <w:lang w:eastAsia="zh-TW"/>
+              </w:rPr>
+              <w:t>Kargin</w:t>
+            </w:r>
+            <w:r>
+              <w:rPr>
+                <w:rFonts w:ascii="Lora" w:eastAsia="Times New Roman" w:hAnsi="Lora"/>
+                <w:b/>
+                <w:i/>
+                <w:iCs/>
+                <w:color w:val="2D4239"/>
+                <w:sz w:val="21"/>
+                <w:szCs w:val="21"/>
+                <w:lang w:eastAsia="zh-TW"/>
+              </w:rPr>
+              <w:t xml:space="preserve"> Vladis</w:t>
+            </w:r>
+            <w:r>
+              <w:rPr>
+                <w:rFonts w:ascii="Lora" w:eastAsia="Times New Roman" w:hAnsi="Lora"/>
+                <w:b/>
+                <w:i/>
+                <w:iCs/>
+                <w:color w:val="2D4239"/>
+                <w:sz w:val="21"/>
+                <w:szCs w:val="21"/>
+                <w:lang w:eastAsia="zh-TW"/>
+              </w:rPr>
+              <w:t xml:space="preserve">lav </w:t>
+            </w:r>
+            <w:r>
+              <w:rPr>
+                <w:rFonts w:ascii="Lora" w:eastAsia="Times New Roman" w:hAnsi="Lora"/>
+                <w:b/>
+                <w:i/>
+                <w:iCs/>
+                <w:color w:val="2D4239"/>
+                <w:sz w:val="21"/>
+                <w:szCs w:val="21"/>
+                <w:lang w:eastAsia="zh-TW"/>
+              </w:rPr>
+              <w:t>| Binghamton University</w:t>
+            </w:r>
+            <w:r>
+              <w:rPr>
+                <w:rFonts w:ascii="Lora" w:eastAsia="Times New Roman" w:hAnsi="Lora"/>
+                <w:b/>
+                <w:color w:val="2D4239"/>
+                <w:sz w:val="21"/>
+                <w:szCs w:val="21"/>
+                <w:lang w:eastAsia="zh-TW"/>
+              </w:rPr>
+              <w:t xml:space="preserve"> </w:t>
+            </w:r>
+          </w:p>
+          <w:p>
+            <w:pPr>
+              <w:rPr>
+                <w:rFonts w:ascii="Lora" w:eastAsia="Times New Roman" w:hAnsi="Lora"/>
+                <w:b/>
+                <w:color w:val="2D4239"/>
+                <w:sz w:val="21"/>
+                <w:szCs w:val="21"/>
+                <w:lang w:eastAsia="zh-TW"/>
+              </w:rPr>
+            </w:pPr>
           </w:p>
           <w:p>
             <w:pPr>
@@ -1689,220 +1938,40 @@
                 <w:szCs w:val="20"/>
                 <w:lang w:eastAsia="zh-TW"/>
               </w:rPr>
-              <w:t>Develop and compare regression, random forest, and MARS models using cross-validation and predictive performance metrics; published a reproducible Quarto report online (manuscript in preparation).</w:t>
-            </w:r>
-          </w:p>
-        </w:tc>
-      </w:tr>
-      <w:tr>
-        <w:trPr>
-          <w:trHeight w:val="144"/>
-        </w:trPr>
-        <w:tc>
-          <w:tcPr>
-            <w:tcW w:w="11507" w:type="dxa"/>
-            <w:gridSpan w:val="9"/>
-          </w:tcPr>
-          <w:p>
-            <w:pPr>
-              <w:rPr>
-                <w:rFonts w:eastAsia="Times New Roman" w:cstheme="minorHAnsi"/>
-                <w:bCs/>
-                <w:lang w:eastAsia="zh-TW"/>
-              </w:rPr>
-            </w:pPr>
-          </w:p>
-        </w:tc>
-      </w:tr>
-      <w:tr>
-        <w:trPr>
-          <w:trHeight w:val="144"/>
-        </w:trPr>
-        <w:tc>
-          <w:tcPr>
-            <w:tcW w:w="1274" w:type="dxa"/>
-            <w:gridSpan w:val="2"/>
-            <w:tcMar>
-              <w:left w:w="57" w:type="dxa"/>
-            </w:tcMar>
-          </w:tcPr>
-          <w:p>
-            <w:pPr>
-              <w:ind w:left="79"/>
-              <w:rPr>
-                <w:rFonts w:ascii="Roboto" w:hAnsi="Roboto" w:cs="Times New Roman (Body CS)"/>
-                <w:sz w:val="20"/>
-                <w:szCs w:val="20"/>
-              </w:rPr>
-            </w:pPr>
-            <w:r>
-              <w:rPr>
-                <w:rFonts w:ascii="Roboto" w:hAnsi="Roboto" w:cs="Times New Roman (Body CS)"/>
-                <w:sz w:val="20"/>
-                <w:szCs w:val="20"/>
-              </w:rPr>
-              <w:t>SEP</w:t>
-            </w:r>
-            <w:r>
-              <w:rPr>
-                <w:rFonts w:ascii="Roboto" w:hAnsi="Roboto" w:cs="Times New Roman (Body CS)"/>
-                <w:sz w:val="20"/>
-                <w:szCs w:val="20"/>
-              </w:rPr>
-              <w:t xml:space="preserve"> 20</w:t>
-            </w:r>
-            <w:r>
-              <w:rPr>
-                <w:rFonts w:ascii="Roboto" w:hAnsi="Roboto" w:cs="Times New Roman (Body CS)"/>
-                <w:sz w:val="20"/>
-                <w:szCs w:val="20"/>
-              </w:rPr>
-              <w:t>25</w:t>
-            </w:r>
-            <w:r>
-              <w:rPr>
-                <w:rFonts w:ascii="Roboto" w:hAnsi="Roboto" w:cs="Times New Roman (Body CS)"/>
-                <w:sz w:val="20"/>
-                <w:szCs w:val="20"/>
-              </w:rPr>
-              <w:t xml:space="preserve"> - </w:t>
-            </w:r>
-            <w:r>
-              <w:rPr>
-                <w:rFonts w:ascii="Roboto" w:hAnsi="Roboto" w:cs="Times New Roman (Body CS)"/>
-                <w:sz w:val="20"/>
-                <w:szCs w:val="20"/>
-              </w:rPr>
-              <w:t>APR</w:t>
-            </w:r>
-            <w:r>
-              <w:rPr>
-                <w:rFonts w:ascii="Roboto" w:hAnsi="Roboto" w:cs="Times New Roman (Body CS)"/>
-                <w:sz w:val="20"/>
-                <w:szCs w:val="20"/>
-              </w:rPr>
-              <w:t xml:space="preserve"> 2026</w:t>
-            </w:r>
-          </w:p>
-        </w:tc>
-        <w:tc>
-          <w:tcPr>
-            <w:tcW w:w="578" w:type="dxa"/>
-            <w:tcBorders>
-              <w:right w:val="single" w:sz="4" w:space="0" w:color="000000"/>
-            </w:tcBorders>
-          </w:tcPr>
-          <w:p>
-            <w:pPr>
-              <w:rPr>
-                <w:rFonts w:ascii="Lora" w:eastAsia="Times New Roman" w:hAnsi="Lora"/>
-                <w:b/>
-                <w:sz w:val="21"/>
-                <w:szCs w:val="21"/>
-                <w:lang w:eastAsia="zh-TW"/>
-              </w:rPr>
-            </w:pPr>
-          </w:p>
-        </w:tc>
-        <w:tc>
-          <w:tcPr>
-            <w:tcW w:w="9655" w:type="dxa"/>
-            <w:gridSpan w:val="6"/>
-            <w:tcBorders>
-              <w:left w:val="single" w:sz="4" w:space="0" w:color="000000"/>
-            </w:tcBorders>
-          </w:tcPr>
-          <w:p>
-            <w:pPr>
-              <w:rPr>
-                <w:rFonts w:ascii="Roboto" w:hAnsi="Roboto"/>
-                <w:b/>
-                <w:bCs/>
-                <w:sz w:val="26"/>
-                <w:szCs w:val="26"/>
-              </w:rPr>
-            </w:pPr>
-            <w:r>
-              <w:rPr>
-                <w:rFonts w:ascii="Roboto" w:hAnsi="Roboto"/>
-                <w:b/>
-                <w:bCs/>
-                <w:sz w:val="26"/>
-                <w:szCs w:val="26"/>
-              </w:rPr>
-              <w:t xml:space="preserve">A </w:t>
-            </w:r>
-            <w:r>
-              <w:rPr>
-                <w:rFonts w:ascii="Roboto" w:hAnsi="Roboto"/>
-                <w:b/>
-                <w:bCs/>
-                <w:sz w:val="26"/>
-                <w:szCs w:val="26"/>
-              </w:rPr>
-              <w:t>Mixed-Methods Analysis of Promotion and Prevention Mindsets</w:t>
-            </w:r>
-          </w:p>
-          <w:p>
-            <w:pPr>
-              <w:rPr>
-                <w:rFonts w:ascii="Lora" w:eastAsia="Times New Roman" w:hAnsi="Lora"/>
-                <w:b/>
-                <w:color w:val="2D4239"/>
-                <w:sz w:val="21"/>
-                <w:szCs w:val="21"/>
-                <w:lang w:eastAsia="zh-TW"/>
-              </w:rPr>
-            </w:pPr>
-            <w:r>
-              <w:rPr>
-                <w:rFonts w:ascii="Lora" w:eastAsia="Times New Roman" w:hAnsi="Lora"/>
-                <w:b/>
-                <w:i/>
-                <w:iCs/>
-                <w:color w:val="2D4239"/>
-                <w:sz w:val="21"/>
-                <w:szCs w:val="21"/>
-                <w:lang w:eastAsia="zh-TW"/>
-              </w:rPr>
-              <w:t xml:space="preserve">Undergraduate Research with Dr. Shane McCarty and 3 peers </w:t>
-            </w:r>
-            <w:r>
-              <w:rPr>
-                <w:rFonts w:ascii="Lora" w:eastAsia="Times New Roman" w:hAnsi="Lora"/>
-                <w:b/>
-                <w:i/>
-                <w:iCs/>
-                <w:color w:val="2D4239"/>
-                <w:sz w:val="21"/>
-                <w:szCs w:val="21"/>
-                <w:lang w:eastAsia="zh-TW"/>
-              </w:rPr>
-              <w:t>| Binghamton University</w:t>
-            </w:r>
-            <w:r>
-              <w:rPr>
-                <w:rFonts w:ascii="Lora" w:eastAsia="Times New Roman" w:hAnsi="Lora"/>
-                <w:b/>
-                <w:color w:val="2D4239"/>
-                <w:sz w:val="21"/>
-                <w:szCs w:val="21"/>
-                <w:lang w:eastAsia="zh-TW"/>
-              </w:rPr>
-              <w:t xml:space="preserve"> </w:t>
-            </w:r>
-          </w:p>
-          <w:p>
-            <w:pPr>
-              <w:rPr>
-                <w:rFonts w:ascii="Lora" w:eastAsia="Times New Roman" w:hAnsi="Lora"/>
-                <w:b/>
-                <w:color w:val="2D4239"/>
-                <w:sz w:val="21"/>
-                <w:szCs w:val="21"/>
-                <w:lang w:eastAsia="zh-TW"/>
-              </w:rPr>
-            </w:pPr>
+              <w:t xml:space="preserve">Predict health information avoidance in colorectal cancer using logistic regression, multivariate adaptive regression splines (MARS), and random forest classifiers in R with </w:t>
+            </w:r>
+            <w:proofErr w:type="spellStart"/>
+            <w:r>
+              <w:rPr>
+                <w:rFonts w:ascii="Roboto" w:eastAsia="Times New Roman" w:hAnsi="Roboto"/>
+                <w:bCs/>
+                <w:sz w:val="20"/>
+                <w:szCs w:val="20"/>
+                <w:lang w:eastAsia="zh-TW"/>
+              </w:rPr>
+              <w:t>tidymodels</w:t>
+            </w:r>
+            <w:proofErr w:type="spellEnd"/>
+            <w:r>
+              <w:rPr>
+                <w:rFonts w:ascii="Roboto" w:eastAsia="Times New Roman" w:hAnsi="Roboto"/>
+                <w:bCs/>
+                <w:sz w:val="20"/>
+                <w:szCs w:val="20"/>
+                <w:lang w:eastAsia="zh-TW"/>
+              </w:rPr>
+              <w:t xml:space="preserve"> and caret</w:t>
+            </w:r>
+            <w:r>
+              <w:rPr>
+                <w:rFonts w:ascii="Roboto" w:eastAsia="Times New Roman" w:hAnsi="Roboto"/>
+                <w:bCs/>
+                <w:sz w:val="20"/>
+                <w:szCs w:val="20"/>
+                <w:lang w:eastAsia="zh-TW"/>
+              </w:rPr>
+              <w:t xml:space="preserve">. </w:t>
+            </w:r>
           </w:p>
           <w:p>
             <w:pPr>
@@ -1930,28 +1999,283 @@
                 <w:szCs w:val="20"/>
                 <w:lang w:eastAsia="zh-TW"/>
               </w:rPr>
-              <w:t xml:space="preserve">Applied </w:t>
-            </w:r>
-            <w:r>
-              <w:rPr>
-                <w:rFonts w:ascii="Roboto" w:eastAsia="Times New Roman" w:hAnsi="Roboto"/>
-                <w:bCs/>
-                <w:sz w:val="20"/>
-                <w:szCs w:val="20"/>
-                <w:lang w:eastAsia="zh-TW"/>
-              </w:rPr>
-              <w:t>logistic regression modelling in R to investigate whether promotion and prevention mindsets predict health and safety-related goal preferences</w:t>
-            </w:r>
-            <w:r>
-              <w:rPr>
-                <w:rFonts w:ascii="Roboto" w:eastAsia="Times New Roman" w:hAnsi="Roboto"/>
-                <w:bCs/>
-                <w:sz w:val="20"/>
-                <w:szCs w:val="20"/>
-                <w:lang w:eastAsia="zh-TW"/>
-              </w:rPr>
-              <w:t>.</w:t>
-            </w:r>
+              <w:t xml:space="preserve">Evaluate and compare model performance using cross-validation and predictive metrics, documenting results in a reproducible Quarto and LaTeX </w:t>
+            </w:r>
+            <w:hyperlink r:id="rId15" w:history="1">
+              <w:r>
+                <w:rPr>
+                  <w:rStyle w:val="Hyperlink"/>
+                  <w:rFonts w:ascii="Roboto" w:eastAsia="Times New Roman" w:hAnsi="Roboto"/>
+                  <w:bCs/>
+                  <w:sz w:val="20"/>
+                  <w:szCs w:val="20"/>
+                  <w:lang w:eastAsia="zh-TW"/>
+                </w:rPr>
+                <w:t>report</w:t>
+              </w:r>
+            </w:hyperlink>
+            <w:r>
+              <w:rPr>
+                <w:rFonts w:ascii="Roboto" w:eastAsia="Times New Roman" w:hAnsi="Roboto"/>
+                <w:bCs/>
+                <w:sz w:val="20"/>
+                <w:szCs w:val="20"/>
+                <w:lang w:eastAsia="zh-TW"/>
+              </w:rPr>
+              <w:t xml:space="preserve"> (manuscript </w:t>
+            </w:r>
+            <w:r>
+              <w:rPr>
+                <w:rFonts w:ascii="Roboto" w:eastAsia="Times New Roman" w:hAnsi="Roboto"/>
+                <w:bCs/>
+                <w:sz w:val="20"/>
+                <w:szCs w:val="20"/>
+                <w:lang w:eastAsia="zh-TW"/>
+              </w:rPr>
+              <w:t>under</w:t>
+            </w:r>
+            <w:r>
+              <w:rPr>
+                <w:rFonts w:ascii="Roboto" w:eastAsia="Times New Roman" w:hAnsi="Roboto"/>
+                <w:bCs/>
+                <w:sz w:val="20"/>
+                <w:szCs w:val="20"/>
+                <w:lang w:eastAsia="zh-TW"/>
+              </w:rPr>
+              <w:t xml:space="preserve"> </w:t>
+            </w:r>
+            <w:r>
+              <w:rPr>
+                <w:rFonts w:ascii="Roboto" w:eastAsia="Times New Roman" w:hAnsi="Roboto"/>
+                <w:bCs/>
+                <w:sz w:val="20"/>
+                <w:szCs w:val="20"/>
+                <w:lang w:eastAsia="zh-TW"/>
+              </w:rPr>
+              <w:t>review</w:t>
+            </w:r>
+            <w:r>
+              <w:rPr>
+                <w:rFonts w:ascii="Roboto" w:eastAsia="Times New Roman" w:hAnsi="Roboto"/>
+                <w:bCs/>
+                <w:sz w:val="20"/>
+                <w:szCs w:val="20"/>
+                <w:lang w:eastAsia="zh-TW"/>
+              </w:rPr>
+              <w:t>).</w:t>
+            </w:r>
+          </w:p>
+        </w:tc>
+      </w:tr>
+      <w:tr>
+        <w:trPr>
+          <w:trHeight w:val="144"/>
+        </w:trPr>
+        <w:tc>
+          <w:tcPr>
+            <w:tcW w:w="11507" w:type="dxa"/>
+            <w:gridSpan w:val="9"/>
+          </w:tcPr>
+          <w:p>
+            <w:pPr>
+              <w:rPr>
+                <w:rFonts w:eastAsia="Times New Roman" w:cstheme="minorHAnsi"/>
+                <w:bCs/>
+                <w:lang w:eastAsia="zh-TW"/>
+              </w:rPr>
+            </w:pPr>
+          </w:p>
+        </w:tc>
+      </w:tr>
+      <w:tr>
+        <w:trPr>
+          <w:trHeight w:val="144"/>
+        </w:trPr>
+        <w:tc>
+          <w:tcPr>
+            <w:tcW w:w="1274" w:type="dxa"/>
+            <w:gridSpan w:val="2"/>
+            <w:tcMar>
+              <w:left w:w="57" w:type="dxa"/>
+            </w:tcMar>
+          </w:tcPr>
+          <w:p>
+            <w:pPr>
+              <w:ind w:left="79"/>
+              <w:rPr>
+                <w:rFonts w:ascii="Roboto" w:hAnsi="Roboto" w:cs="Times New Roman (Body CS)"/>
+                <w:sz w:val="20"/>
+                <w:szCs w:val="20"/>
+              </w:rPr>
+            </w:pPr>
+            <w:r>
+              <w:rPr>
+                <w:rFonts w:ascii="Roboto" w:hAnsi="Roboto" w:cs="Times New Roman (Body CS)"/>
+                <w:sz w:val="20"/>
+                <w:szCs w:val="20"/>
+              </w:rPr>
+              <w:t>SEP</w:t>
+            </w:r>
+            <w:r>
+              <w:rPr>
+                <w:rFonts w:ascii="Roboto" w:hAnsi="Roboto" w:cs="Times New Roman (Body CS)"/>
+                <w:sz w:val="20"/>
+                <w:szCs w:val="20"/>
+              </w:rPr>
+              <w:t xml:space="preserve"> 20</w:t>
+            </w:r>
+            <w:r>
+              <w:rPr>
+                <w:rFonts w:ascii="Roboto" w:hAnsi="Roboto" w:cs="Times New Roman (Body CS)"/>
+                <w:sz w:val="20"/>
+                <w:szCs w:val="20"/>
+              </w:rPr>
+              <w:t>25</w:t>
+            </w:r>
+            <w:r>
+              <w:rPr>
+                <w:rFonts w:ascii="Roboto" w:hAnsi="Roboto" w:cs="Times New Roman (Body CS)"/>
+                <w:sz w:val="20"/>
+                <w:szCs w:val="20"/>
+              </w:rPr>
+              <w:t xml:space="preserve"> - </w:t>
+            </w:r>
+            <w:r>
+              <w:rPr>
+                <w:rFonts w:ascii="Roboto" w:hAnsi="Roboto" w:cs="Times New Roman (Body CS)"/>
+                <w:sz w:val="20"/>
+                <w:szCs w:val="20"/>
+              </w:rPr>
+              <w:t>APR</w:t>
+            </w:r>
+            <w:r>
+              <w:rPr>
+                <w:rFonts w:ascii="Roboto" w:hAnsi="Roboto" w:cs="Times New Roman (Body CS)"/>
+                <w:sz w:val="20"/>
+                <w:szCs w:val="20"/>
+              </w:rPr>
+              <w:t xml:space="preserve"> 2026</w:t>
+            </w:r>
+          </w:p>
+        </w:tc>
+        <w:tc>
+          <w:tcPr>
+            <w:tcW w:w="578" w:type="dxa"/>
+            <w:tcBorders>
+              <w:right w:val="single" w:sz="4" w:space="0" w:color="000000"/>
+            </w:tcBorders>
+          </w:tcPr>
+          <w:p>
+            <w:pPr>
+              <w:rPr>
+                <w:rFonts w:ascii="Lora" w:eastAsia="Times New Roman" w:hAnsi="Lora"/>
+                <w:b/>
+                <w:sz w:val="21"/>
+                <w:szCs w:val="21"/>
+                <w:lang w:eastAsia="zh-TW"/>
+              </w:rPr>
+            </w:pPr>
+          </w:p>
+        </w:tc>
+        <w:tc>
+          <w:tcPr>
+            <w:tcW w:w="9655" w:type="dxa"/>
+            <w:gridSpan w:val="6"/>
+            <w:tcBorders>
+              <w:left w:val="single" w:sz="4" w:space="0" w:color="000000"/>
+            </w:tcBorders>
+          </w:tcPr>
+          <w:p>
+            <w:pPr>
+              <w:rPr>
+                <w:rFonts w:ascii="Roboto" w:hAnsi="Roboto"/>
+                <w:b/>
+                <w:bCs/>
+                <w:sz w:val="26"/>
+                <w:szCs w:val="26"/>
+              </w:rPr>
+            </w:pPr>
+            <w:r>
+              <w:rPr>
+                <w:rFonts w:ascii="Roboto" w:hAnsi="Roboto"/>
+                <w:b/>
+                <w:bCs/>
+                <w:sz w:val="26"/>
+                <w:szCs w:val="26"/>
+              </w:rPr>
+              <w:t xml:space="preserve">A </w:t>
+            </w:r>
+            <w:r>
+              <w:rPr>
+                <w:rFonts w:ascii="Roboto" w:hAnsi="Roboto"/>
+                <w:b/>
+                <w:bCs/>
+                <w:sz w:val="26"/>
+                <w:szCs w:val="26"/>
+              </w:rPr>
+              <w:t>Mixed-Methods Analysis of Promotion and Prevention Mindsets</w:t>
+            </w:r>
+          </w:p>
+          <w:p>
+            <w:pPr>
+              <w:rPr>
+                <w:rFonts w:ascii="Lora" w:eastAsia="Times New Roman" w:hAnsi="Lora"/>
+                <w:b/>
+                <w:color w:val="2D4239"/>
+                <w:sz w:val="21"/>
+                <w:szCs w:val="21"/>
+                <w:lang w:eastAsia="zh-TW"/>
+              </w:rPr>
+            </w:pPr>
+            <w:r>
+              <w:rPr>
+                <w:rFonts w:ascii="Lora" w:eastAsia="Times New Roman" w:hAnsi="Lora"/>
+                <w:b/>
+                <w:i/>
+                <w:iCs/>
+                <w:color w:val="2D4239"/>
+                <w:sz w:val="21"/>
+                <w:szCs w:val="21"/>
+                <w:lang w:eastAsia="zh-TW"/>
+              </w:rPr>
+              <w:t xml:space="preserve">Undergraduate Research with Dr. Shane McCarty and 3 peers </w:t>
+            </w:r>
+            <w:r>
+              <w:rPr>
+                <w:rFonts w:ascii="Lora" w:eastAsia="Times New Roman" w:hAnsi="Lora"/>
+                <w:b/>
+                <w:i/>
+                <w:iCs/>
+                <w:color w:val="2D4239"/>
+                <w:sz w:val="21"/>
+                <w:szCs w:val="21"/>
+                <w:lang w:eastAsia="zh-TW"/>
+              </w:rPr>
+              <w:t>| Binghamton University</w:t>
+            </w:r>
+            <w:r>
+              <w:rPr>
+                <w:rFonts w:ascii="Lora" w:eastAsia="Times New Roman" w:hAnsi="Lora"/>
+                <w:b/>
+                <w:color w:val="2D4239"/>
+                <w:sz w:val="21"/>
+                <w:szCs w:val="21"/>
+                <w:lang w:eastAsia="zh-TW"/>
+              </w:rPr>
+              <w:t xml:space="preserve"> </w:t>
+            </w:r>
+          </w:p>
+          <w:p>
+            <w:pPr>
+              <w:rPr>
+                <w:rFonts w:ascii="Lora" w:eastAsia="Times New Roman" w:hAnsi="Lora"/>
+                <w:b/>
+                <w:color w:val="2D4239"/>
+                <w:sz w:val="21"/>
+                <w:szCs w:val="21"/>
+                <w:lang w:eastAsia="zh-TW"/>
+              </w:rPr>
+            </w:pPr>
           </w:p>
           <w:p>
             <w:pPr>
@@ -1979,7 +2303,39 @@
                 <w:szCs w:val="20"/>
                 <w:lang w:eastAsia="zh-TW"/>
               </w:rPr>
-              <w:t>Collaborated on a mixed-methods research project combining quantitative analyses with qualitative coding to examine public conceptions of community health and safety.</w:t>
+              <w:t xml:space="preserve">Contributed quantitative analyses to a mixed-methods study integrating statistical </w:t>
+            </w:r>
+            <w:proofErr w:type="spellStart"/>
+            <w:r>
+              <w:rPr>
+                <w:rFonts w:ascii="Roboto" w:eastAsia="Times New Roman" w:hAnsi="Roboto"/>
+                <w:bCs/>
+                <w:sz w:val="20"/>
+                <w:szCs w:val="20"/>
+                <w:lang w:eastAsia="zh-TW"/>
+              </w:rPr>
+              <w:t>modeling</w:t>
+            </w:r>
+            <w:proofErr w:type="spellEnd"/>
+            <w:r>
+              <w:rPr>
+                <w:rFonts w:ascii="Roboto" w:eastAsia="Times New Roman" w:hAnsi="Roboto"/>
+                <w:bCs/>
+                <w:sz w:val="20"/>
+                <w:szCs w:val="20"/>
+                <w:lang w:eastAsia="zh-TW"/>
+              </w:rPr>
+              <w:t xml:space="preserve"> with team-conducted qualitative coding on community health and safety perceptions</w:t>
+            </w:r>
+            <w:r>
+              <w:rPr>
+                <w:rFonts w:ascii="Roboto" w:eastAsia="Times New Roman" w:hAnsi="Roboto"/>
+                <w:bCs/>
+                <w:sz w:val="20"/>
+                <w:szCs w:val="20"/>
+                <w:lang w:eastAsia="zh-TW"/>
+              </w:rPr>
+              <w:t>.</w:t>
             </w:r>
           </w:p>
           <w:p>
@@ -2008,226 +2364,30 @@
                 <w:szCs w:val="20"/>
                 <w:lang w:eastAsia="zh-TW"/>
               </w:rPr>
-              <w:t>Contributed to a 2025 SCRA presentation and served as first author on a poster abstract accepted for the 2026 APHA Annual Meeting.</w:t>
-            </w:r>
-          </w:p>
-        </w:tc>
-      </w:tr>
-      <w:tr>
-        <w:trPr>
-          <w:trHeight w:val="144"/>
-        </w:trPr>
-        <w:tc>
-          <w:tcPr>
-            <w:tcW w:w="11507" w:type="dxa"/>
-            <w:gridSpan w:val="9"/>
-          </w:tcPr>
-          <w:p>
-            <w:pPr>
-              <w:spacing w:line="276" w:lineRule="auto"/>
-              <w:rPr>
-                <w:rFonts w:ascii="Roboto" w:eastAsia="Times New Roman" w:hAnsi="Roboto"/>
-                <w:b/>
-                <w:sz w:val="24"/>
-                <w:szCs w:val="24"/>
-                <w:lang w:val="en-US" w:eastAsia="zh-TW"/>
-              </w:rPr>
-            </w:pPr>
-          </w:p>
-        </w:tc>
-      </w:tr>
-      <w:tr>
-        <w:trPr>
-          <w:trHeight w:val="144"/>
-        </w:trPr>
-        <w:tc>
-          <w:tcPr>
-            <w:tcW w:w="1274" w:type="dxa"/>
-            <w:gridSpan w:val="2"/>
-            <w:tcMar>
-              <w:left w:w="57" w:type="dxa"/>
-            </w:tcMar>
-          </w:tcPr>
-          <w:p>
-            <w:pPr>
-              <w:ind w:left="79"/>
-              <w:rPr>
-                <w:rFonts w:ascii="Roboto" w:hAnsi="Roboto" w:cs="Times New Roman (Body CS)"/>
-                <w:sz w:val="20"/>
-                <w:szCs w:val="20"/>
-              </w:rPr>
-            </w:pPr>
-            <w:r>
-              <w:rPr>
-                <w:rFonts w:ascii="Roboto" w:hAnsi="Roboto" w:cs="Times New Roman (Body CS)"/>
-                <w:sz w:val="20"/>
-                <w:szCs w:val="20"/>
-              </w:rPr>
-              <w:t>AUG</w:t>
-            </w:r>
-            <w:r>
-              <w:rPr>
-                <w:rFonts w:ascii="Roboto" w:hAnsi="Roboto" w:cs="Times New Roman (Body CS)"/>
-                <w:sz w:val="20"/>
-                <w:szCs w:val="20"/>
-              </w:rPr>
-              <w:t xml:space="preserve"> 20</w:t>
-            </w:r>
-            <w:r>
-              <w:rPr>
-                <w:rFonts w:ascii="Roboto" w:hAnsi="Roboto" w:cs="Times New Roman (Body CS)"/>
-                <w:sz w:val="20"/>
-                <w:szCs w:val="20"/>
-              </w:rPr>
-              <w:t>2</w:t>
-            </w:r>
-            <w:r>
-              <w:rPr>
-                <w:rFonts w:ascii="Roboto" w:hAnsi="Roboto" w:cs="Times New Roman (Body CS)"/>
-                <w:sz w:val="20"/>
-                <w:szCs w:val="20"/>
-              </w:rPr>
-              <w:t>3</w:t>
-            </w:r>
-            <w:r>
-              <w:rPr>
-                <w:rFonts w:ascii="Roboto" w:hAnsi="Roboto" w:cs="Times New Roman (Body CS)"/>
-                <w:sz w:val="20"/>
-                <w:szCs w:val="20"/>
-              </w:rPr>
-              <w:t xml:space="preserve"> - </w:t>
-            </w:r>
-            <w:r>
-              <w:rPr>
-                <w:rFonts w:ascii="Roboto" w:hAnsi="Roboto" w:cs="Times New Roman (Body CS)"/>
-                <w:sz w:val="20"/>
-                <w:szCs w:val="20"/>
-              </w:rPr>
-              <w:t>DEC 2024</w:t>
-            </w:r>
-          </w:p>
-        </w:tc>
-        <w:tc>
-          <w:tcPr>
-            <w:tcW w:w="578" w:type="dxa"/>
-            <w:tcBorders>
-              <w:right w:val="single" w:sz="4" w:space="0" w:color="000000"/>
-            </w:tcBorders>
-          </w:tcPr>
-          <w:p>
-            <w:pPr>
-              <w:rPr>
-                <w:rFonts w:ascii="Lora" w:eastAsia="Times New Roman" w:hAnsi="Lora"/>
-                <w:b/>
-                <w:sz w:val="21"/>
-                <w:szCs w:val="21"/>
-                <w:lang w:eastAsia="zh-TW"/>
-              </w:rPr>
-            </w:pPr>
-          </w:p>
-        </w:tc>
-        <w:tc>
-          <w:tcPr>
-            <w:tcW w:w="9655" w:type="dxa"/>
-            <w:gridSpan w:val="6"/>
-            <w:tcBorders>
-              <w:left w:val="single" w:sz="4" w:space="0" w:color="000000"/>
-            </w:tcBorders>
-          </w:tcPr>
-          <w:p>
-            <w:pPr>
-              <w:rPr>
-                <w:rFonts w:ascii="Roboto" w:hAnsi="Roboto"/>
-                <w:b/>
-                <w:bCs/>
-                <w:sz w:val="26"/>
-                <w:szCs w:val="26"/>
-              </w:rPr>
-            </w:pPr>
-            <w:r>
-              <w:rPr>
-                <w:rFonts w:ascii="Roboto" w:hAnsi="Roboto"/>
-                <w:b/>
-                <w:bCs/>
-                <w:sz w:val="26"/>
-                <w:szCs w:val="26"/>
-              </w:rPr>
-              <w:t>First-Year Research Immersion: Community and Global Public Health</w:t>
-            </w:r>
-          </w:p>
-          <w:p>
-            <w:pPr>
-              <w:rPr>
-                <w:rFonts w:ascii="Lora" w:eastAsia="Times New Roman" w:hAnsi="Lora"/>
-                <w:b/>
-                <w:color w:val="2D4239"/>
-                <w:sz w:val="21"/>
-                <w:szCs w:val="21"/>
-                <w:lang w:eastAsia="zh-TW"/>
-              </w:rPr>
-            </w:pPr>
-            <w:r>
-              <w:rPr>
-                <w:rFonts w:ascii="Lora" w:eastAsia="Times New Roman" w:hAnsi="Lora"/>
-                <w:b/>
-                <w:i/>
-                <w:iCs/>
-                <w:color w:val="2D4239"/>
-                <w:sz w:val="21"/>
-                <w:szCs w:val="21"/>
-                <w:lang w:eastAsia="zh-TW"/>
-              </w:rPr>
-              <w:t>Undergraduate Research</w:t>
-            </w:r>
-            <w:r>
-              <w:rPr>
-                <w:rFonts w:ascii="Lora" w:eastAsia="Times New Roman" w:hAnsi="Lora"/>
-                <w:b/>
-                <w:i/>
-                <w:iCs/>
-                <w:color w:val="2D4239"/>
-                <w:sz w:val="21"/>
-                <w:szCs w:val="21"/>
-                <w:lang w:eastAsia="zh-TW"/>
-              </w:rPr>
-              <w:t xml:space="preserve"> </w:t>
-            </w:r>
-            <w:r>
-              <w:rPr>
-                <w:rFonts w:ascii="Lora" w:eastAsia="Times New Roman" w:hAnsi="Lora"/>
-                <w:b/>
-                <w:i/>
-                <w:iCs/>
-                <w:color w:val="2D4239"/>
-                <w:sz w:val="21"/>
-                <w:szCs w:val="21"/>
-                <w:lang w:eastAsia="zh-TW"/>
-              </w:rPr>
-              <w:t>| Binghamton University</w:t>
-            </w:r>
-            <w:r>
-              <w:rPr>
-                <w:rFonts w:ascii="Lora" w:eastAsia="Times New Roman" w:hAnsi="Lora"/>
-                <w:b/>
-                <w:color w:val="2D4239"/>
-                <w:sz w:val="21"/>
-                <w:szCs w:val="21"/>
-                <w:lang w:eastAsia="zh-TW"/>
-              </w:rPr>
-              <w:t xml:space="preserve"> </w:t>
-            </w:r>
-          </w:p>
-          <w:p>
-            <w:pPr>
-              <w:rPr>
-                <w:rFonts w:ascii="Lora" w:eastAsia="Times New Roman" w:hAnsi="Lora"/>
-                <w:b/>
-                <w:color w:val="2D4239"/>
-                <w:sz w:val="21"/>
-                <w:szCs w:val="21"/>
-                <w:lang w:eastAsia="zh-TW"/>
-              </w:rPr>
-            </w:pPr>
+              <w:t xml:space="preserve">Applied logistic regression </w:t>
+            </w:r>
+            <w:proofErr w:type="spellStart"/>
+            <w:r>
+              <w:rPr>
+                <w:rFonts w:ascii="Roboto" w:eastAsia="Times New Roman" w:hAnsi="Roboto"/>
+                <w:bCs/>
+                <w:sz w:val="20"/>
+                <w:szCs w:val="20"/>
+                <w:lang w:eastAsia="zh-TW"/>
+              </w:rPr>
+              <w:t>modeling</w:t>
+            </w:r>
+            <w:proofErr w:type="spellEnd"/>
+            <w:r>
+              <w:rPr>
+                <w:rFonts w:ascii="Roboto" w:eastAsia="Times New Roman" w:hAnsi="Roboto"/>
+                <w:bCs/>
+                <w:sz w:val="20"/>
+                <w:szCs w:val="20"/>
+                <w:lang w:eastAsia="zh-TW"/>
+              </w:rPr>
+              <w:t xml:space="preserve"> in R to investigate whether promotion and prevention mindsets predict health and safety-related goal preferences</w:t>
+            </w:r>
           </w:p>
           <w:p>
             <w:pPr>
@@ -2255,8 +2415,306 @@
                 <w:szCs w:val="20"/>
                 <w:lang w:eastAsia="zh-TW"/>
               </w:rPr>
-              <w:t>Collaborated with a seven-person team on women’s health, mental health, vaccination, and reproductive health research.</w:t>
-            </w:r>
+              <w:t>S</w:t>
+            </w:r>
+            <w:r>
+              <w:rPr>
+                <w:rFonts w:ascii="Roboto" w:eastAsia="Times New Roman" w:hAnsi="Roboto"/>
+                <w:bCs/>
+                <w:sz w:val="20"/>
+                <w:szCs w:val="20"/>
+                <w:lang w:eastAsia="zh-TW"/>
+              </w:rPr>
+              <w:t>erved as first author on a poster abstract accepted for the 2026 APHA Annual Meeting</w:t>
+            </w:r>
+            <w:r>
+              <w:rPr>
+                <w:rFonts w:ascii="Roboto" w:eastAsia="Times New Roman" w:hAnsi="Roboto"/>
+                <w:bCs/>
+                <w:sz w:val="20"/>
+                <w:szCs w:val="20"/>
+                <w:lang w:eastAsia="zh-TW"/>
+              </w:rPr>
+              <w:t xml:space="preserve"> and c</w:t>
+            </w:r>
+            <w:r>
+              <w:rPr>
+                <w:rFonts w:ascii="Roboto" w:eastAsia="Times New Roman" w:hAnsi="Roboto"/>
+                <w:bCs/>
+                <w:sz w:val="20"/>
+                <w:szCs w:val="20"/>
+                <w:lang w:eastAsia="zh-TW"/>
+              </w:rPr>
+              <w:t xml:space="preserve">o-authored a 2025 </w:t>
+            </w:r>
+            <w:r>
+              <w:rPr>
+                <w:rFonts w:ascii="Roboto" w:eastAsia="Times New Roman" w:hAnsi="Roboto"/>
+                <w:bCs/>
+                <w:sz w:val="20"/>
+                <w:szCs w:val="20"/>
+                <w:lang w:eastAsia="zh-TW"/>
+              </w:rPr>
+              <w:t xml:space="preserve">Society for Community Research &amp; Action </w:t>
+            </w:r>
+            <w:r>
+              <w:rPr>
+                <w:rFonts w:ascii="Roboto" w:eastAsia="Times New Roman" w:hAnsi="Roboto"/>
+                <w:bCs/>
+                <w:sz w:val="20"/>
+                <w:szCs w:val="20"/>
+                <w:lang w:eastAsia="zh-TW"/>
+              </w:rPr>
+              <w:t>presentation</w:t>
+            </w:r>
+            <w:r>
+              <w:rPr>
+                <w:rFonts w:ascii="Roboto" w:eastAsia="Times New Roman" w:hAnsi="Roboto"/>
+                <w:bCs/>
+                <w:sz w:val="20"/>
+                <w:szCs w:val="20"/>
+                <w:lang w:eastAsia="zh-TW"/>
+              </w:rPr>
+              <w:t>.</w:t>
+            </w:r>
+          </w:p>
+        </w:tc>
+      </w:tr>
+      <w:tr>
+        <w:trPr>
+          <w:trHeight w:val="144"/>
+        </w:trPr>
+        <w:tc>
+          <w:tcPr>
+            <w:tcW w:w="11507" w:type="dxa"/>
+            <w:gridSpan w:val="9"/>
+          </w:tcPr>
+          <w:p>
+            <w:pPr>
+              <w:spacing w:line="276" w:lineRule="auto"/>
+              <w:rPr>
+                <w:rFonts w:ascii="Roboto" w:eastAsia="Times New Roman" w:hAnsi="Roboto"/>
+                <w:b/>
+                <w:sz w:val="24"/>
+                <w:szCs w:val="24"/>
+                <w:lang w:val="en-US" w:eastAsia="zh-TW"/>
+              </w:rPr>
+            </w:pPr>
+          </w:p>
+        </w:tc>
+      </w:tr>
+      <w:tr>
+        <w:trPr>
+          <w:trHeight w:val="144"/>
+        </w:trPr>
+        <w:tc>
+          <w:tcPr>
+            <w:tcW w:w="1274" w:type="dxa"/>
+            <w:gridSpan w:val="2"/>
+            <w:tcMar>
+              <w:left w:w="57" w:type="dxa"/>
+            </w:tcMar>
+          </w:tcPr>
+          <w:p>
+            <w:pPr>
+              <w:ind w:left="79"/>
+              <w:rPr>
+                <w:rFonts w:ascii="Roboto" w:hAnsi="Roboto" w:cs="Times New Roman (Body CS)"/>
+                <w:sz w:val="20"/>
+                <w:szCs w:val="20"/>
+              </w:rPr>
+            </w:pPr>
+            <w:r>
+              <w:rPr>
+                <w:rFonts w:ascii="Roboto" w:hAnsi="Roboto" w:cs="Times New Roman (Body CS)"/>
+                <w:sz w:val="20"/>
+                <w:szCs w:val="20"/>
+              </w:rPr>
+              <w:t>AUG</w:t>
+            </w:r>
+            <w:r>
+              <w:rPr>
+                <w:rFonts w:ascii="Roboto" w:hAnsi="Roboto" w:cs="Times New Roman (Body CS)"/>
+                <w:sz w:val="20"/>
+                <w:szCs w:val="20"/>
+              </w:rPr>
+              <w:t xml:space="preserve"> 20</w:t>
+            </w:r>
+            <w:r>
+              <w:rPr>
+                <w:rFonts w:ascii="Roboto" w:hAnsi="Roboto" w:cs="Times New Roman (Body CS)"/>
+                <w:sz w:val="20"/>
+                <w:szCs w:val="20"/>
+              </w:rPr>
+              <w:t>2</w:t>
+            </w:r>
+            <w:r>
+              <w:rPr>
+                <w:rFonts w:ascii="Roboto" w:hAnsi="Roboto" w:cs="Times New Roman (Body CS)"/>
+                <w:sz w:val="20"/>
+                <w:szCs w:val="20"/>
+              </w:rPr>
+              <w:t>3</w:t>
+            </w:r>
+            <w:r>
+              <w:rPr>
+                <w:rFonts w:ascii="Roboto" w:hAnsi="Roboto" w:cs="Times New Roman (Body CS)"/>
+                <w:sz w:val="20"/>
+                <w:szCs w:val="20"/>
+              </w:rPr>
+              <w:t xml:space="preserve"> - </w:t>
+            </w:r>
+            <w:r>
+              <w:rPr>
+                <w:rFonts w:ascii="Roboto" w:hAnsi="Roboto" w:cs="Times New Roman (Body CS)"/>
+                <w:sz w:val="20"/>
+                <w:szCs w:val="20"/>
+              </w:rPr>
+              <w:t>DEC 2024</w:t>
+            </w:r>
+          </w:p>
+        </w:tc>
+        <w:tc>
+          <w:tcPr>
+            <w:tcW w:w="578" w:type="dxa"/>
+            <w:tcBorders>
+              <w:right w:val="single" w:sz="4" w:space="0" w:color="000000"/>
+            </w:tcBorders>
+          </w:tcPr>
+          <w:p>
+            <w:pPr>
+              <w:rPr>
+                <w:rFonts w:ascii="Lora" w:eastAsia="Times New Roman" w:hAnsi="Lora"/>
+                <w:b/>
+                <w:sz w:val="21"/>
+                <w:szCs w:val="21"/>
+                <w:lang w:eastAsia="zh-TW"/>
+              </w:rPr>
+            </w:pPr>
+          </w:p>
+        </w:tc>
+        <w:tc>
+          <w:tcPr>
+            <w:tcW w:w="9655" w:type="dxa"/>
+            <w:gridSpan w:val="6"/>
+            <w:tcBorders>
+              <w:left w:val="single" w:sz="4" w:space="0" w:color="000000"/>
+            </w:tcBorders>
+          </w:tcPr>
+          <w:p>
+            <w:pPr>
+              <w:rPr>
+                <w:rFonts w:ascii="Roboto" w:hAnsi="Roboto"/>
+                <w:b/>
+                <w:bCs/>
+                <w:sz w:val="26"/>
+                <w:szCs w:val="26"/>
+              </w:rPr>
+            </w:pPr>
+            <w:r>
+              <w:rPr>
+                <w:rFonts w:ascii="Roboto" w:hAnsi="Roboto"/>
+                <w:b/>
+                <w:bCs/>
+                <w:sz w:val="26"/>
+                <w:szCs w:val="26"/>
+              </w:rPr>
+              <w:t>First-Year Research Immersion</w:t>
+            </w:r>
+            <w:r>
+              <w:rPr>
+                <w:rFonts w:ascii="Roboto" w:hAnsi="Roboto"/>
+                <w:b/>
+                <w:bCs/>
+                <w:sz w:val="26"/>
+                <w:szCs w:val="26"/>
+              </w:rPr>
+              <w:t xml:space="preserve"> (FRI)</w:t>
+            </w:r>
+            <w:r>
+              <w:rPr>
+                <w:rFonts w:ascii="Roboto" w:hAnsi="Roboto"/>
+                <w:b/>
+                <w:bCs/>
+                <w:sz w:val="26"/>
+                <w:szCs w:val="26"/>
+              </w:rPr>
+              <w:t>: Community and Global Public Health</w:t>
+            </w:r>
+          </w:p>
+          <w:p>
+            <w:pPr>
+              <w:rPr>
+                <w:rFonts w:ascii="Lora" w:eastAsia="Times New Roman" w:hAnsi="Lora"/>
+                <w:b/>
+                <w:color w:val="2D4239"/>
+                <w:sz w:val="21"/>
+                <w:szCs w:val="21"/>
+                <w:lang w:eastAsia="zh-TW"/>
+              </w:rPr>
+            </w:pPr>
+            <w:r>
+              <w:rPr>
+                <w:rFonts w:ascii="Lora" w:eastAsia="Times New Roman" w:hAnsi="Lora"/>
+                <w:b/>
+                <w:i/>
+                <w:iCs/>
+                <w:color w:val="2D4239"/>
+                <w:sz w:val="21"/>
+                <w:szCs w:val="21"/>
+                <w:lang w:eastAsia="zh-TW"/>
+              </w:rPr>
+              <w:t>Undergraduate Research</w:t>
+            </w:r>
+            <w:r>
+              <w:rPr>
+                <w:rFonts w:ascii="Lora" w:eastAsia="Times New Roman" w:hAnsi="Lora"/>
+                <w:b/>
+                <w:i/>
+                <w:iCs/>
+                <w:color w:val="2D4239"/>
+                <w:sz w:val="21"/>
+                <w:szCs w:val="21"/>
+                <w:lang w:eastAsia="zh-TW"/>
+              </w:rPr>
+              <w:t xml:space="preserve"> </w:t>
+            </w:r>
+            <w:r>
+              <w:rPr>
+                <w:rFonts w:ascii="Lora" w:eastAsia="Times New Roman" w:hAnsi="Lora"/>
+                <w:b/>
+                <w:i/>
+                <w:iCs/>
+                <w:color w:val="2D4239"/>
+                <w:sz w:val="21"/>
+                <w:szCs w:val="21"/>
+                <w:lang w:eastAsia="zh-TW"/>
+              </w:rPr>
+              <w:t>| Binghamton University</w:t>
+            </w:r>
+            <w:r>
+              <w:rPr>
+                <w:rFonts w:ascii="Lora" w:eastAsia="Times New Roman" w:hAnsi="Lora"/>
+                <w:b/>
+                <w:color w:val="2D4239"/>
+                <w:sz w:val="21"/>
+                <w:szCs w:val="21"/>
+                <w:lang w:eastAsia="zh-TW"/>
+              </w:rPr>
+              <w:t xml:space="preserve"> </w:t>
+            </w:r>
+          </w:p>
+          <w:p>
+            <w:pPr>
+              <w:rPr>
+                <w:rFonts w:ascii="Lora" w:eastAsia="Times New Roman" w:hAnsi="Lora"/>
+                <w:b/>
+                <w:color w:val="2D4239"/>
+                <w:sz w:val="21"/>
+                <w:szCs w:val="21"/>
+                <w:lang w:eastAsia="zh-TW"/>
+              </w:rPr>
+            </w:pPr>
           </w:p>
           <w:p>
             <w:pPr>
@@ -2284,239 +2742,38 @@
                 <w:szCs w:val="20"/>
                 <w:lang w:eastAsia="zh-TW"/>
               </w:rPr>
-              <w:lastRenderedPageBreak/>
-              <w:t>Conducted SPSS analyses, designed and distributed a Qualtrics survey, and presented findings through two FRI poster presentations.</w:t>
-            </w:r>
-          </w:p>
-        </w:tc>
-      </w:tr>
-      <w:tr>
-        <w:trPr>
-          <w:trHeight w:val="144"/>
-        </w:trPr>
-        <w:tc>
-          <w:tcPr>
-            <w:tcW w:w="11507" w:type="dxa"/>
-            <w:gridSpan w:val="9"/>
-          </w:tcPr>
-          <w:p>
-            <w:pPr>
-              <w:rPr>
-                <w:rFonts w:ascii="Lora" w:eastAsia="Times New Roman" w:hAnsi="Lora"/>
-                <w:bCs/>
-                <w:sz w:val="20"/>
-                <w:szCs w:val="20"/>
-                <w:lang w:eastAsia="zh-TW"/>
-              </w:rPr>
-            </w:pPr>
-          </w:p>
-        </w:tc>
-      </w:tr>
-      <w:tr>
-        <w:trPr>
-          <w:trHeight w:val="144"/>
-        </w:trPr>
-        <w:tc>
-          <w:tcPr>
-            <w:tcW w:w="1274" w:type="dxa"/>
-            <w:gridSpan w:val="2"/>
-            <w:tcMar>
-              <w:left w:w="57" w:type="dxa"/>
-            </w:tcMar>
-          </w:tcPr>
-          <w:p>
-            <w:pPr>
-              <w:ind w:left="79"/>
-              <w:rPr>
-                <w:rFonts w:ascii="Roboto" w:hAnsi="Roboto" w:cs="Times New Roman (Body CS)"/>
-                <w:sz w:val="20"/>
-                <w:szCs w:val="20"/>
-              </w:rPr>
-            </w:pPr>
-            <w:r>
-              <w:rPr>
-                <w:rFonts w:ascii="Roboto" w:hAnsi="Roboto" w:cs="Times New Roman (Body CS)"/>
-                <w:sz w:val="20"/>
-                <w:szCs w:val="20"/>
-              </w:rPr>
-              <w:t>JUN</w:t>
-            </w:r>
-            <w:r>
-              <w:rPr>
-                <w:rFonts w:ascii="Roboto" w:hAnsi="Roboto" w:cs="Times New Roman (Body CS)"/>
-                <w:sz w:val="20"/>
-                <w:szCs w:val="20"/>
-              </w:rPr>
-              <w:t xml:space="preserve"> 20</w:t>
-            </w:r>
-            <w:r>
-              <w:rPr>
-                <w:rFonts w:ascii="Roboto" w:hAnsi="Roboto" w:cs="Times New Roman (Body CS)"/>
-                <w:sz w:val="20"/>
-                <w:szCs w:val="20"/>
-              </w:rPr>
-              <w:t>2</w:t>
-            </w:r>
-            <w:r>
-              <w:rPr>
-                <w:rFonts w:ascii="Roboto" w:hAnsi="Roboto" w:cs="Times New Roman (Body CS)"/>
-                <w:sz w:val="20"/>
-                <w:szCs w:val="20"/>
-              </w:rPr>
-              <w:t>5</w:t>
-            </w:r>
-            <w:r>
-              <w:rPr>
-                <w:rFonts w:ascii="Roboto" w:hAnsi="Roboto" w:cs="Times New Roman (Body CS)"/>
-                <w:sz w:val="20"/>
-                <w:szCs w:val="20"/>
-              </w:rPr>
-              <w:t xml:space="preserve"> - </w:t>
-            </w:r>
-            <w:r>
-              <w:rPr>
-                <w:rFonts w:ascii="Roboto" w:hAnsi="Roboto" w:cs="Times New Roman (Body CS)"/>
-                <w:sz w:val="20"/>
-                <w:szCs w:val="20"/>
-              </w:rPr>
-              <w:t>PRESENT</w:t>
-            </w:r>
-          </w:p>
-        </w:tc>
-        <w:tc>
-          <w:tcPr>
-            <w:tcW w:w="578" w:type="dxa"/>
-            <w:tcBorders>
-              <w:right w:val="single" w:sz="4" w:space="0" w:color="000000"/>
-            </w:tcBorders>
-          </w:tcPr>
-          <w:p>
-            <w:pPr>
-              <w:rPr>
-                <w:rFonts w:ascii="Lora" w:eastAsia="Times New Roman" w:hAnsi="Lora"/>
-                <w:b/>
-                <w:sz w:val="21"/>
-                <w:szCs w:val="21"/>
-                <w:lang w:eastAsia="zh-TW"/>
-              </w:rPr>
-            </w:pPr>
-          </w:p>
-        </w:tc>
-        <w:tc>
-          <w:tcPr>
-            <w:tcW w:w="9655" w:type="dxa"/>
-            <w:gridSpan w:val="6"/>
-            <w:tcBorders>
-              <w:left w:val="single" w:sz="4" w:space="0" w:color="000000"/>
-            </w:tcBorders>
-          </w:tcPr>
-          <w:p>
-            <w:pPr>
-              <w:rPr>
-                <w:rFonts w:ascii="Roboto" w:hAnsi="Roboto"/>
-                <w:b/>
-                <w:bCs/>
-                <w:sz w:val="26"/>
-                <w:szCs w:val="26"/>
-              </w:rPr>
-            </w:pPr>
-            <w:r>
-              <w:rPr>
-                <w:rFonts w:ascii="Roboto" w:hAnsi="Roboto"/>
-                <w:b/>
-                <w:bCs/>
-                <w:sz w:val="26"/>
-                <w:szCs w:val="26"/>
-              </w:rPr>
-              <w:t>Political Affiliation and Zero-Sum Beliefs</w:t>
-            </w:r>
-          </w:p>
-          <w:p>
-            <w:pPr>
-              <w:rPr>
-                <w:rFonts w:ascii="Lora" w:eastAsia="Times New Roman" w:hAnsi="Lora"/>
-                <w:b/>
-                <w:color w:val="2D4239"/>
-                <w:sz w:val="21"/>
-                <w:szCs w:val="21"/>
-                <w:lang w:eastAsia="zh-TW"/>
-              </w:rPr>
-            </w:pPr>
-            <w:r>
-              <w:rPr>
-                <w:rFonts w:ascii="Lora" w:eastAsia="Times New Roman" w:hAnsi="Lora"/>
-                <w:b/>
-                <w:i/>
-                <w:iCs/>
-                <w:color w:val="2D4239"/>
-                <w:sz w:val="21"/>
-                <w:szCs w:val="21"/>
-                <w:lang w:eastAsia="zh-TW"/>
-              </w:rPr>
-              <w:t>Undergraduate Research</w:t>
-            </w:r>
-            <w:r>
-              <w:rPr>
-                <w:rFonts w:ascii="Lora" w:eastAsia="Times New Roman" w:hAnsi="Lora"/>
-                <w:b/>
-                <w:i/>
-                <w:iCs/>
-                <w:color w:val="2D4239"/>
-                <w:sz w:val="21"/>
-                <w:szCs w:val="21"/>
-                <w:lang w:eastAsia="zh-TW"/>
-              </w:rPr>
-              <w:t xml:space="preserve"> with Dr. Shane McCarty and 2 peers</w:t>
-            </w:r>
-            <w:r>
-              <w:rPr>
-                <w:rFonts w:ascii="Lora" w:eastAsia="Times New Roman" w:hAnsi="Lora"/>
-                <w:b/>
-                <w:i/>
-                <w:iCs/>
-                <w:color w:val="2D4239"/>
-                <w:sz w:val="21"/>
-                <w:szCs w:val="21"/>
-                <w:lang w:eastAsia="zh-TW"/>
-              </w:rPr>
-              <w:t xml:space="preserve"> </w:t>
-            </w:r>
-            <w:r>
-              <w:rPr>
-                <w:rFonts w:ascii="Lora" w:eastAsia="Times New Roman" w:hAnsi="Lora"/>
-                <w:b/>
-                <w:i/>
-                <w:iCs/>
-                <w:color w:val="2D4239"/>
-                <w:sz w:val="21"/>
-                <w:szCs w:val="21"/>
-                <w:lang w:eastAsia="zh-TW"/>
-              </w:rPr>
-              <w:t>| Binghamton University</w:t>
-            </w:r>
-            <w:r>
-              <w:rPr>
-                <w:rFonts w:ascii="Lora" w:eastAsia="Times New Roman" w:hAnsi="Lora"/>
-                <w:b/>
-                <w:color w:val="2D4239"/>
-                <w:sz w:val="21"/>
-                <w:szCs w:val="21"/>
-                <w:lang w:eastAsia="zh-TW"/>
-              </w:rPr>
-              <w:t xml:space="preserve"> </w:t>
-            </w:r>
-          </w:p>
-          <w:p>
-            <w:pPr>
-              <w:rPr>
-                <w:rFonts w:ascii="Lora" w:eastAsia="Times New Roman" w:hAnsi="Lora"/>
-                <w:b/>
-                <w:color w:val="2D4239"/>
-                <w:sz w:val="21"/>
-                <w:szCs w:val="21"/>
-                <w:lang w:eastAsia="zh-TW"/>
-              </w:rPr>
-            </w:pPr>
+              <w:t xml:space="preserve">Collaborated with a 7-person team to research the impact of Endometriosis on women’s mental health, culminating in two poster presentations to peers and faculty at </w:t>
+            </w:r>
+            <w:r>
+              <w:rPr>
+                <w:rFonts w:ascii="Roboto" w:eastAsia="Times New Roman" w:hAnsi="Roboto"/>
+                <w:bCs/>
+                <w:sz w:val="20"/>
+                <w:szCs w:val="20"/>
+                <w:lang w:eastAsia="zh-TW"/>
+              </w:rPr>
+              <w:t xml:space="preserve">FRI </w:t>
+            </w:r>
+            <w:r>
+              <w:rPr>
+                <w:rFonts w:ascii="Roboto" w:eastAsia="Times New Roman" w:hAnsi="Roboto"/>
+                <w:bCs/>
+                <w:sz w:val="20"/>
+                <w:szCs w:val="20"/>
+                <w:lang w:eastAsia="zh-TW"/>
+              </w:rPr>
+              <w:t>conferences in December 2023 and 2024</w:t>
+            </w:r>
+            <w:r>
+              <w:rPr>
+                <w:rFonts w:ascii="Roboto" w:eastAsia="Times New Roman" w:hAnsi="Roboto"/>
+                <w:bCs/>
+                <w:sz w:val="20"/>
+                <w:szCs w:val="20"/>
+                <w:lang w:eastAsia="zh-TW"/>
+              </w:rPr>
+              <w:t>.</w:t>
+            </w:r>
           </w:p>
           <w:p>
             <w:pPr>
@@ -2544,7 +2801,17 @@
                 <w:szCs w:val="20"/>
                 <w:lang w:eastAsia="zh-TW"/>
               </w:rPr>
-              <w:t>Examine political party affiliation and zero-sum beliefs as predictors of voter choice in the 2024 U.S. election.</w:t>
+              <w:t>Conducted quantitative data analysis using SPSS for 6+ hrs/week to examine vaccine hesitancy among pregnant women</w:t>
+            </w:r>
+            <w:r>
+              <w:rPr>
+                <w:rFonts w:ascii="Roboto" w:eastAsia="Times New Roman" w:hAnsi="Roboto"/>
+                <w:bCs/>
+                <w:sz w:val="20"/>
+                <w:szCs w:val="20"/>
+                <w:lang w:eastAsia="zh-TW"/>
+              </w:rPr>
+              <w:t>.</w:t>
             </w:r>
           </w:p>
           <w:p>
@@ -2573,7 +2840,29 @@
                 <w:szCs w:val="20"/>
                 <w:lang w:eastAsia="zh-TW"/>
               </w:rPr>
-              <w:t>Conduct ANOVA/Kruskal-Wallis tests, logistic regression, and machine-learning classification in R (manuscript in preparation)</w:t>
+              <w:t xml:space="preserve">Designed and distributed a comprehensive campus-wide survey using Qualtrics, collecting and </w:t>
+            </w:r>
+            <w:proofErr w:type="spellStart"/>
+            <w:r>
+              <w:rPr>
+                <w:rFonts w:ascii="Roboto" w:eastAsia="Times New Roman" w:hAnsi="Roboto"/>
+                <w:bCs/>
+                <w:sz w:val="20"/>
+                <w:szCs w:val="20"/>
+                <w:lang w:eastAsia="zh-TW"/>
+              </w:rPr>
+              <w:t>analyzing</w:t>
+            </w:r>
+            <w:proofErr w:type="spellEnd"/>
+            <w:r>
+              <w:rPr>
+                <w:rFonts w:ascii="Roboto" w:eastAsia="Times New Roman" w:hAnsi="Roboto"/>
+                <w:bCs/>
+                <w:sz w:val="20"/>
+                <w:szCs w:val="20"/>
+                <w:lang w:eastAsia="zh-TW"/>
+              </w:rPr>
+              <w:t xml:space="preserve"> responses</w:t>
             </w:r>
             <w:r>
               <w:rPr>
@@ -2612,75 +2901,6 @@
       </w:tr>
       <w:tr>
         <w:trPr>
-          <w:trHeight w:val="153"/>
-        </w:trPr>
-        <w:tc>
-          <w:tcPr>
-            <w:tcW w:w="11507" w:type="dxa"/>
-            <w:gridSpan w:val="9"/>
-          </w:tcPr>
-          <w:p>
-            <w:pPr>
-              <w:spacing w:line="276" w:lineRule="auto"/>
-              <w:rPr>
-                <w:rFonts w:ascii="Roboto" w:hAnsi="Roboto"/>
-                <w:b/>
-                <w:bCs/>
-                <w:color w:val="2D4239"/>
-              </w:rPr>
-            </w:pPr>
-          </w:p>
-          <w:p>
-            <w:pPr>
-              <w:spacing w:line="276" w:lineRule="auto"/>
-              <w:rPr>
-                <w:rFonts w:ascii="Roboto" w:hAnsi="Roboto"/>
-                <w:b/>
-                <w:bCs/>
-                <w:color w:val="2D4239"/>
-                <w:sz w:val="32"/>
-                <w:szCs w:val="32"/>
-              </w:rPr>
-            </w:pPr>
-            <w:r>
-              <w:rPr>
-                <w:rFonts w:ascii="Roboto" w:hAnsi="Roboto"/>
-                <w:b/>
-                <w:bCs/>
-                <w:color w:val="2D4239"/>
-                <w:sz w:val="32"/>
-                <w:szCs w:val="32"/>
-              </w:rPr>
-              <w:t>Professional</w:t>
-            </w:r>
-            <w:r>
-              <w:rPr>
-                <w:rFonts w:ascii="Roboto" w:hAnsi="Roboto"/>
-                <w:b/>
-                <w:bCs/>
-                <w:color w:val="2D4239"/>
-                <w:sz w:val="32"/>
-                <w:szCs w:val="32"/>
-              </w:rPr>
-              <w:t xml:space="preserve"> Experience</w:t>
-            </w:r>
-          </w:p>
-          <w:p>
-            <w:pPr>
-              <w:spacing w:line="276" w:lineRule="auto"/>
-              <w:rPr>
-                <w:rFonts w:ascii="Roboto" w:eastAsia="Times New Roman" w:hAnsi="Roboto"/>
-                <w:b/>
-                <w:sz w:val="24"/>
-                <w:szCs w:val="24"/>
-                <w:lang w:eastAsia="zh-TW"/>
-              </w:rPr>
-            </w:pPr>
-          </w:p>
-        </w:tc>
-      </w:tr>
-      <w:tr>
-        <w:trPr>
           <w:trHeight w:val="144"/>
         </w:trPr>
         <w:tc>
@@ -2730,7 +2950,7 @@
                 <w:sz w:val="20"/>
                 <w:szCs w:val="20"/>
               </w:rPr>
-              <w:t>6</w:t>
+              <w:t>5</w:t>
             </w:r>
             <w:r>
               <w:rPr>
@@ -2795,7 +3015,7 @@
                 <w:sz w:val="26"/>
                 <w:szCs w:val="26"/>
               </w:rPr>
-              <w:t>Quantitative Intern, First-Year Research Immersion Program</w:t>
+              <w:t xml:space="preserve">Examining Zero-Sum Beliefs and </w:t>
             </w:r>
             <w:r>
               <w:rPr>
@@ -2805,7 +3025,7 @@
                 <w:sz w:val="26"/>
                 <w:szCs w:val="26"/>
               </w:rPr>
-              <w:t xml:space="preserve"> </w:t>
+              <w:t>Political Affiliation</w:t>
             </w:r>
           </w:p>
           <w:p>
@@ -2830,7 +3050,33 @@
                 <w:szCs w:val="21"/>
                 <w:lang w:eastAsia="zh-TW"/>
               </w:rPr>
-              <w:t xml:space="preserve">With Dr. Megan Fegley and Dr. Caitlin Light </w:t>
+              <w:t>Undergraduate Research</w:t>
+            </w:r>
+            <w:r>
+              <w:rPr>
+                <w:rFonts w:ascii="Lora" w:eastAsia="Times New Roman" w:hAnsi="Lora"/>
+                <w:b/>
+                <w:i/>
+                <w:iCs/>
+                <w:color w:val="2D4239"/>
+                <w:sz w:val="21"/>
+                <w:szCs w:val="21"/>
+                <w:lang w:eastAsia="zh-TW"/>
+              </w:rPr>
+              <w:t xml:space="preserve"> with Dr. Shane McCarty and 2 peers</w:t>
+            </w:r>
+            <w:r>
+              <w:rPr>
+                <w:rFonts w:ascii="Lora" w:eastAsia="Times New Roman" w:hAnsi="Lora"/>
+                <w:b/>
+                <w:i/>
+                <w:iCs/>
+                <w:color w:val="2D4239"/>
+                <w:sz w:val="21"/>
+                <w:szCs w:val="21"/>
+                <w:lang w:eastAsia="zh-TW"/>
+              </w:rPr>
+              <w:t xml:space="preserve"> </w:t>
             </w:r>
             <w:r>
               <w:rPr>
@@ -2895,7 +3141,7 @@
                 <w:szCs w:val="20"/>
                 <w:lang w:eastAsia="zh-TW"/>
               </w:rPr>
-              <w:t>Contribute to R Shiny dashboards for student outcomes and research dissemination metrics used in program evaluation and reporting.</w:t>
+              <w:t>Examine political party affiliation and zero-sum beliefs as predictors of voter choice in the 2024 U.S. election.</w:t>
             </w:r>
           </w:p>
           <w:p>
@@ -2916,15 +3162,100 @@
                 <w:lang w:eastAsia="zh-TW"/>
               </w:rPr>
             </w:pPr>
-            <w:r>
-              <w:rPr>
-                <w:rFonts w:ascii="Roboto" w:eastAsia="Times New Roman" w:hAnsi="Roboto"/>
-                <w:bCs/>
-                <w:sz w:val="20"/>
-                <w:szCs w:val="20"/>
-                <w:lang w:eastAsia="zh-TW"/>
-              </w:rPr>
-              <w:t>Develop an integrated dissemination database and Qualtrics surveys to collect publication and presentation outcomes across FRI programs</w:t>
+            <w:proofErr w:type="spellStart"/>
+            <w:r>
+              <w:rPr>
+                <w:rFonts w:ascii="Roboto" w:eastAsia="Times New Roman" w:hAnsi="Roboto"/>
+                <w:bCs/>
+                <w:sz w:val="20"/>
+                <w:szCs w:val="20"/>
+                <w:lang w:eastAsia="zh-TW"/>
+              </w:rPr>
+              <w:t>Analyze</w:t>
+            </w:r>
+            <w:proofErr w:type="spellEnd"/>
+            <w:r>
+              <w:rPr>
+                <w:rFonts w:ascii="Roboto" w:eastAsia="Times New Roman" w:hAnsi="Roboto"/>
+                <w:bCs/>
+                <w:sz w:val="20"/>
+                <w:szCs w:val="20"/>
+                <w:lang w:eastAsia="zh-TW"/>
+              </w:rPr>
+              <w:t xml:space="preserve"> group differences </w:t>
+            </w:r>
+            <w:r>
+              <w:rPr>
+                <w:rFonts w:ascii="Roboto" w:eastAsia="Times New Roman" w:hAnsi="Roboto"/>
+                <w:bCs/>
+                <w:sz w:val="20"/>
+                <w:szCs w:val="20"/>
+                <w:lang w:eastAsia="zh-TW"/>
+              </w:rPr>
+              <w:t>using</w:t>
+            </w:r>
+            <w:r>
+              <w:rPr>
+                <w:rFonts w:ascii="Roboto" w:eastAsia="Times New Roman" w:hAnsi="Roboto"/>
+                <w:bCs/>
+                <w:sz w:val="20"/>
+                <w:szCs w:val="20"/>
+                <w:lang w:eastAsia="zh-TW"/>
+              </w:rPr>
+              <w:t xml:space="preserve"> ANOVA/Kruskal-Wallis tests, logistic regression, and machine learning classification</w:t>
+            </w:r>
+            <w:r>
+              <w:rPr>
+                <w:rFonts w:ascii="Roboto" w:eastAsia="Times New Roman" w:hAnsi="Roboto"/>
+                <w:bCs/>
+                <w:sz w:val="20"/>
+                <w:szCs w:val="20"/>
+                <w:lang w:eastAsia="zh-TW"/>
+              </w:rPr>
+              <w:t xml:space="preserve"> in R; </w:t>
+            </w:r>
+            <w:r>
+              <w:rPr>
+                <w:rFonts w:ascii="Roboto" w:eastAsia="Times New Roman" w:hAnsi="Roboto"/>
+                <w:bCs/>
+                <w:sz w:val="20"/>
+                <w:szCs w:val="20"/>
+                <w:lang w:eastAsia="zh-TW"/>
+              </w:rPr>
+              <w:t xml:space="preserve">synthesize findings into a scientific </w:t>
+            </w:r>
+            <w:hyperlink r:id="rId16" w:history="1">
+              <w:r>
+                <w:rPr>
+                  <w:rStyle w:val="Hyperlink"/>
+                  <w:rFonts w:ascii="Roboto" w:eastAsia="Times New Roman" w:hAnsi="Roboto"/>
+                  <w:bCs/>
+                  <w:sz w:val="20"/>
+                  <w:szCs w:val="20"/>
+                  <w:lang w:eastAsia="zh-TW"/>
+                </w:rPr>
+                <w:t>report</w:t>
+              </w:r>
+            </w:hyperlink>
+            <w:r>
+              <w:rPr>
+                <w:rFonts w:ascii="Roboto" w:eastAsia="Times New Roman" w:hAnsi="Roboto"/>
+                <w:bCs/>
+                <w:sz w:val="20"/>
+                <w:szCs w:val="20"/>
+                <w:lang w:eastAsia="zh-TW"/>
+              </w:rPr>
+              <w:t xml:space="preserve"> </w:t>
+            </w:r>
+            <w:r>
+              <w:rPr>
+                <w:rFonts w:ascii="Roboto" w:eastAsia="Times New Roman" w:hAnsi="Roboto"/>
+                <w:bCs/>
+                <w:sz w:val="20"/>
+                <w:szCs w:val="20"/>
+                <w:lang w:eastAsia="zh-TW"/>
+              </w:rPr>
+              <w:t>(manuscript in preparation)</w:t>
             </w:r>
             <w:r>
               <w:rPr>
@@ -2963,6 +3294,75 @@
       </w:tr>
       <w:tr>
         <w:trPr>
+          <w:trHeight w:val="153"/>
+        </w:trPr>
+        <w:tc>
+          <w:tcPr>
+            <w:tcW w:w="11507" w:type="dxa"/>
+            <w:gridSpan w:val="9"/>
+          </w:tcPr>
+          <w:p>
+            <w:pPr>
+              <w:spacing w:line="276" w:lineRule="auto"/>
+              <w:rPr>
+                <w:rFonts w:ascii="Roboto" w:hAnsi="Roboto"/>
+                <w:b/>
+                <w:bCs/>
+                <w:color w:val="2D4239"/>
+              </w:rPr>
+            </w:pPr>
+          </w:p>
+          <w:p>
+            <w:pPr>
+              <w:spacing w:line="276" w:lineRule="auto"/>
+              <w:rPr>
+                <w:rFonts w:ascii="Roboto" w:hAnsi="Roboto"/>
+                <w:b/>
+                <w:bCs/>
+                <w:color w:val="2D4239"/>
+                <w:sz w:val="32"/>
+                <w:szCs w:val="32"/>
+              </w:rPr>
+            </w:pPr>
+            <w:r>
+              <w:rPr>
+                <w:rFonts w:ascii="Roboto" w:hAnsi="Roboto"/>
+                <w:b/>
+                <w:bCs/>
+                <w:color w:val="2D4239"/>
+                <w:sz w:val="32"/>
+                <w:szCs w:val="32"/>
+              </w:rPr>
+              <w:t>Professional</w:t>
+            </w:r>
+            <w:r>
+              <w:rPr>
+                <w:rFonts w:ascii="Roboto" w:hAnsi="Roboto"/>
+                <w:b/>
+                <w:bCs/>
+                <w:color w:val="2D4239"/>
+                <w:sz w:val="32"/>
+                <w:szCs w:val="32"/>
+              </w:rPr>
+              <w:t xml:space="preserve"> Experience</w:t>
+            </w:r>
+          </w:p>
+          <w:p>
+            <w:pPr>
+              <w:spacing w:line="276" w:lineRule="auto"/>
+              <w:rPr>
+                <w:rFonts w:ascii="Roboto" w:eastAsia="Times New Roman" w:hAnsi="Roboto"/>
+                <w:b/>
+                <w:sz w:val="24"/>
+                <w:szCs w:val="24"/>
+                <w:lang w:eastAsia="zh-TW"/>
+              </w:rPr>
+            </w:pPr>
+          </w:p>
+        </w:tc>
+      </w:tr>
+      <w:tr>
+        <w:trPr>
           <w:trHeight w:val="144"/>
         </w:trPr>
         <w:tc>
@@ -3077,7 +3477,7 @@
                 <w:sz w:val="26"/>
                 <w:szCs w:val="26"/>
               </w:rPr>
-              <w:t>Mental Health Workshop Quantitative Intern</w:t>
+              <w:t>Quantitative Intern, First-Year Research Immersion Program</w:t>
             </w:r>
             <w:r>
               <w:rPr>
@@ -3112,7 +3512,7 @@
                 <w:szCs w:val="21"/>
                 <w:lang w:eastAsia="zh-TW"/>
               </w:rPr>
-              <w:t>Summer Internship with Dr. Shane McCarty</w:t>
+              <w:t xml:space="preserve">Paid Internship </w:t>
             </w:r>
             <w:r>
               <w:rPr>
@@ -3125,7 +3525,20 @@
                 <w:szCs w:val="21"/>
                 <w:lang w:eastAsia="zh-TW"/>
               </w:rPr>
-              <w:t xml:space="preserve"> </w:t>
+              <w:t>with</w:t>
+            </w:r>
+            <w:r>
+              <w:rPr>
+                <w:rFonts w:ascii="Lora" w:eastAsia="Times New Roman" w:hAnsi="Lora"/>
+                <w:b/>
+                <w:i/>
+                <w:iCs/>
+                <w:color w:val="2D4239"/>
+                <w:sz w:val="21"/>
+                <w:szCs w:val="21"/>
+                <w:lang w:eastAsia="zh-TW"/>
+              </w:rPr>
+              <w:t xml:space="preserve"> Dr. Megan Fegley and Dr. Caitlin Light </w:t>
             </w:r>
             <w:r>
               <w:rPr>
@@ -3190,7 +3603,7 @@
                 <w:szCs w:val="20"/>
                 <w:lang w:eastAsia="zh-TW"/>
               </w:rPr>
-              <w:t>Designed Qualtrics surveys and quantitative evaluation methods assessing mental health literacy, well-being, nonviolent communication, and workshop effectiveness</w:t>
+              <w:t>Contribute 10 hrs/week of quantitative expertise to FRI program evaluation by developing R Shiny dashboards, integrating dissemination records, and designing Qualtrics surveys</w:t>
             </w:r>
             <w:r>
               <w:rPr>
@@ -3229,17 +3642,67 @@
                 <w:szCs w:val="20"/>
                 <w:lang w:eastAsia="zh-TW"/>
               </w:rPr>
-              <w:t>Created interactive data visualizations and individualized wellness profiles using Observable JS</w:t>
-            </w:r>
-            <w:r>
-              <w:rPr>
-                <w:rFonts w:ascii="Roboto" w:eastAsia="Times New Roman" w:hAnsi="Roboto"/>
-                <w:bCs/>
-                <w:sz w:val="20"/>
-                <w:szCs w:val="20"/>
-                <w:lang w:eastAsia="zh-TW"/>
-              </w:rPr>
-              <w:t>.</w:t>
+              <w:t xml:space="preserve">Develop Google </w:t>
+            </w:r>
+            <w:r>
+              <w:rPr>
+                <w:rFonts w:ascii="Roboto" w:eastAsia="Times New Roman" w:hAnsi="Roboto"/>
+                <w:bCs/>
+                <w:sz w:val="20"/>
+                <w:szCs w:val="20"/>
+                <w:lang w:eastAsia="zh-TW"/>
+              </w:rPr>
+              <w:t>Apps Script</w:t>
+            </w:r>
+            <w:r>
+              <w:rPr>
+                <w:rFonts w:ascii="Roboto" w:eastAsia="Times New Roman" w:hAnsi="Roboto"/>
+                <w:bCs/>
+                <w:sz w:val="20"/>
+                <w:szCs w:val="20"/>
+                <w:lang w:eastAsia="zh-TW"/>
+              </w:rPr>
+              <w:t xml:space="preserve"> </w:t>
+            </w:r>
+            <w:r>
+              <w:rPr>
+                <w:rFonts w:ascii="Roboto" w:eastAsia="Times New Roman" w:hAnsi="Roboto"/>
+                <w:bCs/>
+                <w:sz w:val="20"/>
+                <w:szCs w:val="20"/>
+                <w:lang w:eastAsia="zh-TW"/>
+              </w:rPr>
+              <w:t>automation</w:t>
+            </w:r>
+            <w:r>
+              <w:rPr>
+                <w:rFonts w:ascii="Roboto" w:eastAsia="Times New Roman" w:hAnsi="Roboto"/>
+                <w:bCs/>
+                <w:sz w:val="20"/>
+                <w:szCs w:val="20"/>
+                <w:lang w:eastAsia="zh-TW"/>
+              </w:rPr>
+              <w:t xml:space="preserve"> workflows to </w:t>
+            </w:r>
+            <w:r>
+              <w:rPr>
+                <w:rFonts w:ascii="Roboto" w:eastAsia="Times New Roman" w:hAnsi="Roboto"/>
+                <w:bCs/>
+                <w:sz w:val="20"/>
+                <w:szCs w:val="20"/>
+                <w:lang w:eastAsia="zh-TW"/>
+              </w:rPr>
+              <w:t>process survey</w:t>
+            </w:r>
+            <w:r>
+              <w:rPr>
+                <w:rFonts w:ascii="Roboto" w:eastAsia="Times New Roman" w:hAnsi="Roboto"/>
+                <w:bCs/>
+                <w:sz w:val="20"/>
+                <w:szCs w:val="20"/>
+                <w:lang w:eastAsia="zh-TW"/>
+              </w:rPr>
+              <w:t xml:space="preserve"> responses into spreadsheets and organize publication and presentation records.</w:t>
             </w:r>
           </w:p>
           <w:p>
@@ -3268,7 +3731,374 @@
                 <w:szCs w:val="20"/>
                 <w:lang w:eastAsia="zh-TW"/>
               </w:rPr>
-              <w:t>Developed an interactive wellness webpage integrating workshop materials, participant profiles, and trainer-facing visualizations for program evaluation.</w:t>
+              <w:t>Visualize student outcomes and dissemination metrics in interactive R Shiny dashboards to support program evaluation</w:t>
+            </w:r>
+            <w:r>
+              <w:rPr>
+                <w:rFonts w:ascii="Roboto" w:eastAsia="Times New Roman" w:hAnsi="Roboto"/>
+                <w:bCs/>
+                <w:sz w:val="20"/>
+                <w:szCs w:val="20"/>
+                <w:lang w:eastAsia="zh-TW"/>
+              </w:rPr>
+              <w:t xml:space="preserve"> and reporting.</w:t>
+            </w:r>
+          </w:p>
+        </w:tc>
+      </w:tr>
+      <w:tr>
+        <w:trPr>
+          <w:trHeight w:val="144"/>
+        </w:trPr>
+        <w:tc>
+          <w:tcPr>
+            <w:tcW w:w="11507" w:type="dxa"/>
+            <w:gridSpan w:val="9"/>
+          </w:tcPr>
+          <w:p>
+            <w:pPr>
+              <w:rPr>
+                <w:rFonts w:ascii="Lora" w:eastAsia="Times New Roman" w:hAnsi="Lora"/>
+                <w:bCs/>
+                <w:sz w:val="20"/>
+                <w:szCs w:val="20"/>
+                <w:lang w:eastAsia="zh-TW"/>
+              </w:rPr>
+            </w:pPr>
+          </w:p>
+        </w:tc>
+      </w:tr>
+      <w:tr>
+        <w:trPr>
+          <w:trHeight w:val="144"/>
+        </w:trPr>
+        <w:tc>
+          <w:tcPr>
+            <w:tcW w:w="1274" w:type="dxa"/>
+            <w:gridSpan w:val="2"/>
+            <w:tcMar>
+              <w:left w:w="57" w:type="dxa"/>
+            </w:tcMar>
+          </w:tcPr>
+          <w:p>
+            <w:pPr>
+              <w:ind w:left="79"/>
+              <w:rPr>
+                <w:rFonts w:ascii="Roboto" w:hAnsi="Roboto" w:cs="Times New Roman (Body CS)"/>
+                <w:sz w:val="20"/>
+                <w:szCs w:val="20"/>
+              </w:rPr>
+            </w:pPr>
+            <w:r>
+              <w:rPr>
+                <w:rFonts w:ascii="Roboto" w:hAnsi="Roboto" w:cs="Times New Roman (Body CS)"/>
+                <w:sz w:val="20"/>
+                <w:szCs w:val="20"/>
+              </w:rPr>
+              <w:t>JUN</w:t>
+            </w:r>
+            <w:r>
+              <w:rPr>
+                <w:rFonts w:ascii="Roboto" w:hAnsi="Roboto" w:cs="Times New Roman (Body CS)"/>
+                <w:sz w:val="20"/>
+                <w:szCs w:val="20"/>
+              </w:rPr>
+              <w:t xml:space="preserve"> 20</w:t>
+            </w:r>
+            <w:r>
+              <w:rPr>
+                <w:rFonts w:ascii="Roboto" w:hAnsi="Roboto" w:cs="Times New Roman (Body CS)"/>
+                <w:sz w:val="20"/>
+                <w:szCs w:val="20"/>
+              </w:rPr>
+              <w:t>2</w:t>
+            </w:r>
+            <w:r>
+              <w:rPr>
+                <w:rFonts w:ascii="Roboto" w:hAnsi="Roboto" w:cs="Times New Roman (Body CS)"/>
+                <w:sz w:val="20"/>
+                <w:szCs w:val="20"/>
+              </w:rPr>
+              <w:t>6</w:t>
+            </w:r>
+            <w:r>
+              <w:rPr>
+                <w:rFonts w:ascii="Roboto" w:hAnsi="Roboto" w:cs="Times New Roman (Body CS)"/>
+                <w:sz w:val="20"/>
+                <w:szCs w:val="20"/>
+              </w:rPr>
+              <w:t xml:space="preserve"> -</w:t>
+            </w:r>
+            <w:r>
+              <w:rPr>
+                <w:rFonts w:ascii="Roboto" w:hAnsi="Roboto" w:cs="Times New Roman (Body CS)"/>
+                <w:sz w:val="20"/>
+                <w:szCs w:val="20"/>
+              </w:rPr>
+              <w:t>AUG 2026</w:t>
+            </w:r>
+          </w:p>
+        </w:tc>
+        <w:tc>
+          <w:tcPr>
+            <w:tcW w:w="578" w:type="dxa"/>
+            <w:tcBorders>
+              <w:right w:val="single" w:sz="4" w:space="0" w:color="000000"/>
+            </w:tcBorders>
+          </w:tcPr>
+          <w:p>
+            <w:pPr>
+              <w:rPr>
+                <w:rFonts w:ascii="Lora" w:eastAsia="Times New Roman" w:hAnsi="Lora"/>
+                <w:b/>
+                <w:sz w:val="21"/>
+                <w:szCs w:val="21"/>
+                <w:lang w:eastAsia="zh-TW"/>
+              </w:rPr>
+            </w:pPr>
+          </w:p>
+        </w:tc>
+        <w:tc>
+          <w:tcPr>
+            <w:tcW w:w="9655" w:type="dxa"/>
+            <w:gridSpan w:val="6"/>
+            <w:tcBorders>
+              <w:left w:val="single" w:sz="4" w:space="0" w:color="000000"/>
+            </w:tcBorders>
+          </w:tcPr>
+          <w:p>
+            <w:pPr>
+              <w:rPr>
+                <w:rFonts w:ascii="Roboto" w:hAnsi="Roboto"/>
+                <w:b/>
+                <w:bCs/>
+                <w:sz w:val="26"/>
+                <w:szCs w:val="26"/>
+              </w:rPr>
+            </w:pPr>
+            <w:r>
+              <w:rPr>
+                <w:rFonts w:ascii="Roboto" w:hAnsi="Roboto"/>
+                <w:b/>
+                <w:bCs/>
+                <w:sz w:val="26"/>
+                <w:szCs w:val="26"/>
+              </w:rPr>
+              <w:t>Mental Health Workshop Quantitative Intern</w:t>
+            </w:r>
+            <w:r>
+              <w:rPr>
+                <w:rFonts w:ascii="Roboto" w:hAnsi="Roboto"/>
+                <w:b/>
+                <w:bCs/>
+                <w:sz w:val="26"/>
+                <w:szCs w:val="26"/>
+              </w:rPr>
+              <w:t xml:space="preserve"> </w:t>
+            </w:r>
+          </w:p>
+          <w:p>
+            <w:pPr>
+              <w:rPr>
+                <w:rFonts w:ascii="Lora" w:eastAsia="Times New Roman" w:hAnsi="Lora"/>
+                <w:b/>
+                <w:color w:val="2D4239"/>
+                <w:sz w:val="21"/>
+                <w:szCs w:val="21"/>
+                <w:lang w:eastAsia="zh-TW"/>
+              </w:rPr>
+            </w:pPr>
+            <w:r>
+              <w:rPr>
+                <w:rFonts w:ascii="Lora" w:eastAsia="Times New Roman" w:hAnsi="Lora"/>
+                <w:b/>
+                <w:i/>
+                <w:iCs/>
+                <w:color w:val="2D4239"/>
+                <w:sz w:val="21"/>
+                <w:szCs w:val="21"/>
+                <w:lang w:eastAsia="zh-TW"/>
+              </w:rPr>
+              <w:t xml:space="preserve">Paid </w:t>
+            </w:r>
+            <w:r>
+              <w:rPr>
+                <w:rFonts w:ascii="Lora" w:eastAsia="Times New Roman" w:hAnsi="Lora"/>
+                <w:b/>
+                <w:i/>
+                <w:iCs/>
+                <w:color w:val="2D4239"/>
+                <w:sz w:val="21"/>
+                <w:szCs w:val="21"/>
+                <w:lang w:eastAsia="zh-TW"/>
+              </w:rPr>
+              <w:t>Summer Internship with Dr. Shane McCarty</w:t>
+            </w:r>
+            <w:r>
+              <w:rPr>
+                <w:rFonts w:ascii="Lora" w:eastAsia="Times New Roman" w:hAnsi="Lora"/>
+                <w:b/>
+                <w:i/>
+                <w:iCs/>
+                <w:color w:val="2D4239"/>
+                <w:sz w:val="21"/>
+                <w:szCs w:val="21"/>
+                <w:lang w:eastAsia="zh-TW"/>
+              </w:rPr>
+              <w:t xml:space="preserve"> </w:t>
+            </w:r>
+            <w:r>
+              <w:rPr>
+                <w:rFonts w:ascii="Lora" w:eastAsia="Times New Roman" w:hAnsi="Lora"/>
+                <w:b/>
+                <w:i/>
+                <w:iCs/>
+                <w:color w:val="2D4239"/>
+                <w:sz w:val="21"/>
+                <w:szCs w:val="21"/>
+                <w:lang w:eastAsia="zh-TW"/>
+              </w:rPr>
+              <w:t>| Binghamton University</w:t>
+            </w:r>
+            <w:r>
+              <w:rPr>
+                <w:rFonts w:ascii="Lora" w:eastAsia="Times New Roman" w:hAnsi="Lora"/>
+                <w:b/>
+                <w:color w:val="2D4239"/>
+                <w:sz w:val="21"/>
+                <w:szCs w:val="21"/>
+                <w:lang w:eastAsia="zh-TW"/>
+              </w:rPr>
+              <w:t xml:space="preserve"> </w:t>
+            </w:r>
+          </w:p>
+          <w:p>
+            <w:pPr>
+              <w:rPr>
+                <w:rFonts w:ascii="Lora" w:eastAsia="Times New Roman" w:hAnsi="Lora"/>
+                <w:b/>
+                <w:color w:val="2D4239"/>
+                <w:sz w:val="21"/>
+                <w:szCs w:val="21"/>
+                <w:lang w:eastAsia="zh-TW"/>
+              </w:rPr>
+            </w:pPr>
+          </w:p>
+          <w:p>
+            <w:pPr>
+              <w:pStyle w:val="ListParagraph"/>
+              <w:numPr>
+                <w:ilvl w:val="0"/>
+                <w:numId w:val="1"/>
+              </w:numPr>
+              <w:spacing w:after="80"/>
+              <w:ind w:left="357" w:right="567" w:hanging="357"/>
+              <w:contextualSpacing w:val="0"/>
+              <w:rPr>
+                <w:rFonts w:ascii="Roboto" w:eastAsia="Times New Roman" w:hAnsi="Roboto"/>
+                <w:bCs/>
+                <w:sz w:val="20"/>
+                <w:szCs w:val="20"/>
+                <w:lang w:eastAsia="zh-TW"/>
+              </w:rPr>
+            </w:pPr>
+            <w:r>
+              <w:rPr>
+                <w:rFonts w:ascii="Roboto" w:eastAsia="Times New Roman" w:hAnsi="Roboto"/>
+                <w:bCs/>
+                <w:sz w:val="20"/>
+                <w:szCs w:val="20"/>
+                <w:lang w:eastAsia="zh-TW"/>
+              </w:rPr>
+              <w:t>Contributed 60 hrs of quantitative expertise to a mental health workshop by designing evaluation surveys, developing quantitative methods, and building individualized wellness profiles</w:t>
+            </w:r>
+            <w:r>
+              <w:rPr>
+                <w:rFonts w:ascii="Roboto" w:eastAsia="Times New Roman" w:hAnsi="Roboto"/>
+                <w:bCs/>
+                <w:sz w:val="20"/>
+                <w:szCs w:val="20"/>
+                <w:lang w:eastAsia="zh-TW"/>
+              </w:rPr>
+              <w:t>.</w:t>
+            </w:r>
+          </w:p>
+          <w:p>
+            <w:pPr>
+              <w:pStyle w:val="ListParagraph"/>
+              <w:numPr>
+                <w:ilvl w:val="0"/>
+                <w:numId w:val="1"/>
+              </w:numPr>
+              <w:spacing w:after="80"/>
+              <w:ind w:left="357" w:right="567" w:hanging="357"/>
+              <w:contextualSpacing w:val="0"/>
+              <w:rPr>
+                <w:rFonts w:ascii="Roboto" w:eastAsia="Times New Roman" w:hAnsi="Roboto"/>
+                <w:bCs/>
+                <w:sz w:val="20"/>
+                <w:szCs w:val="20"/>
+                <w:lang w:eastAsia="zh-TW"/>
+              </w:rPr>
+            </w:pPr>
+            <w:r>
+              <w:rPr>
+                <w:rFonts w:ascii="Roboto" w:eastAsia="Times New Roman" w:hAnsi="Roboto"/>
+                <w:bCs/>
+                <w:sz w:val="20"/>
+                <w:szCs w:val="20"/>
+                <w:lang w:eastAsia="zh-TW"/>
+              </w:rPr>
+              <w:t>Designed Qualtrics surveys to evaluate mental health literacy, well-being, nonviolent communication, and workshop effectiveness</w:t>
+            </w:r>
+            <w:r>
+              <w:rPr>
+                <w:rFonts w:ascii="Roboto" w:eastAsia="Times New Roman" w:hAnsi="Roboto"/>
+                <w:bCs/>
+                <w:sz w:val="20"/>
+                <w:szCs w:val="20"/>
+                <w:lang w:eastAsia="zh-TW"/>
+              </w:rPr>
+              <w:t>.</w:t>
+            </w:r>
+          </w:p>
+          <w:p>
+            <w:pPr>
+              <w:pStyle w:val="ListParagraph"/>
+              <w:numPr>
+                <w:ilvl w:val="0"/>
+                <w:numId w:val="1"/>
+              </w:numPr>
+              <w:spacing w:after="80"/>
+              <w:ind w:left="357" w:right="567" w:hanging="357"/>
+              <w:contextualSpacing w:val="0"/>
+              <w:rPr>
+                <w:rFonts w:ascii="Roboto" w:eastAsia="Times New Roman" w:hAnsi="Roboto"/>
+                <w:bCs/>
+                <w:sz w:val="20"/>
+                <w:szCs w:val="20"/>
+                <w:lang w:eastAsia="zh-TW"/>
+              </w:rPr>
+            </w:pPr>
+            <w:r>
+              <w:rPr>
+                <w:rFonts w:ascii="Roboto" w:eastAsia="Times New Roman" w:hAnsi="Roboto"/>
+                <w:bCs/>
+                <w:sz w:val="20"/>
+                <w:szCs w:val="20"/>
+                <w:lang w:eastAsia="zh-TW"/>
+              </w:rPr>
+              <w:t>Developed an interactive wellness webpage using Claude and Observable JS to visualize survey results and generate individualized wellness profiles</w:t>
+            </w:r>
+            <w:r>
+              <w:rPr>
+                <w:rFonts w:ascii="Roboto" w:eastAsia="Times New Roman" w:hAnsi="Roboto"/>
+                <w:bCs/>
+                <w:sz w:val="20"/>
+                <w:szCs w:val="20"/>
+                <w:lang w:eastAsia="zh-TW"/>
+              </w:rPr>
+              <w:t>.</w:t>
             </w:r>
           </w:p>
         </w:tc>
@@ -3317,17 +4147,6 @@
                 <w:b/>
                 <w:bCs/>
                 <w:color w:val="2D4239"/>
-              </w:rPr>
-            </w:pPr>
-          </w:p>
-          <w:p>
-            <w:pPr>
-              <w:spacing w:line="276" w:lineRule="auto"/>
-              <w:rPr>
-                <w:rFonts w:ascii="Roboto" w:hAnsi="Roboto"/>
-                <w:b/>
-                <w:bCs/>
-                <w:color w:val="2D4239"/>
                 <w:sz w:val="32"/>
                 <w:szCs w:val="32"/>
               </w:rPr>
@@ -3598,27 +4417,17 @@
                 <w:szCs w:val="20"/>
                 <w:lang w:eastAsia="zh-TW"/>
               </w:rPr>
-              <w:t xml:space="preserve">Mentored undergraduate </w:t>
-            </w:r>
-            <w:r>
-              <w:rPr>
-                <w:rFonts w:ascii="Roboto" w:eastAsia="Times New Roman" w:hAnsi="Roboto"/>
-                <w:bCs/>
-                <w:sz w:val="20"/>
-                <w:szCs w:val="20"/>
-                <w:lang w:eastAsia="zh-TW"/>
-              </w:rPr>
-              <w:t>students</w:t>
-            </w:r>
-            <w:r>
-              <w:rPr>
-                <w:rFonts w:ascii="Roboto" w:eastAsia="Times New Roman" w:hAnsi="Roboto"/>
-                <w:bCs/>
-                <w:sz w:val="20"/>
-                <w:szCs w:val="20"/>
-                <w:lang w:eastAsia="zh-TW"/>
-              </w:rPr>
-              <w:t xml:space="preserve"> in foundational R programming, data analysis, code troubleshooting.</w:t>
+              <w:t>Mentored students in foundational R programming, team-based research, and Quarto reporting across public health projects</w:t>
+            </w:r>
+            <w:r>
+              <w:rPr>
+                <w:rFonts w:ascii="Roboto" w:eastAsia="Times New Roman" w:hAnsi="Roboto"/>
+                <w:bCs/>
+                <w:sz w:val="20"/>
+                <w:szCs w:val="20"/>
+                <w:lang w:eastAsia="zh-TW"/>
+              </w:rPr>
+              <w:t>.</w:t>
             </w:r>
           </w:p>
           <w:p>
@@ -3647,17 +4456,7 @@
                 <w:szCs w:val="20"/>
                 <w:lang w:eastAsia="zh-TW"/>
               </w:rPr>
-              <w:t>Collaborated</w:t>
-            </w:r>
-            <w:r>
-              <w:rPr>
-                <w:rFonts w:ascii="Roboto" w:eastAsia="Times New Roman" w:hAnsi="Roboto"/>
-                <w:bCs/>
-                <w:sz w:val="20"/>
-                <w:szCs w:val="20"/>
-                <w:lang w:eastAsia="zh-TW"/>
-              </w:rPr>
-              <w:t xml:space="preserve"> with the instructor and other research assistants to support research teams’ Quarto research reports</w:t>
+              <w:t>Collaborated with the instructor and other research assistants to support research teams’ Quarto research reports</w:t>
             </w:r>
           </w:p>
         </w:tc>
@@ -3707,6 +4506,7 @@
                 <w:sz w:val="32"/>
                 <w:szCs w:val="32"/>
               </w:rPr>
+              <w:lastRenderedPageBreak/>
               <w:t>Publications</w:t>
             </w:r>
           </w:p>
@@ -3800,7 +4600,25 @@
                 <w:sz w:val="20"/>
                 <w:szCs w:val="20"/>
               </w:rPr>
-              <w:t>, Panzik, J., Wolfe, P., &amp; Fegley, M. (2026).</w:t>
+              <w:t xml:space="preserve">, </w:t>
+            </w:r>
+            <w:proofErr w:type="spellStart"/>
+            <w:r>
+              <w:rPr>
+                <w:rFonts w:ascii="Roboto" w:eastAsia="Times New Roman" w:hAnsi="Roboto"/>
+                <w:sz w:val="20"/>
+                <w:szCs w:val="20"/>
+              </w:rPr>
+              <w:t>Panzik</w:t>
+            </w:r>
+            <w:proofErr w:type="spellEnd"/>
+            <w:r>
+              <w:rPr>
+                <w:rFonts w:ascii="Roboto" w:eastAsia="Times New Roman" w:hAnsi="Roboto"/>
+                <w:sz w:val="20"/>
+                <w:szCs w:val="20"/>
+              </w:rPr>
+              <w:t>, J., Wolfe, P., &amp; Fegley, M. (2026).</w:t>
             </w:r>
           </w:p>
           <w:p>
@@ -3834,7 +4652,7 @@
               </w:rPr>
               <w:br/>
             </w:r>
-            <w:hyperlink r:id="rId14" w:tgtFrame="_blank" w:history="1">
+            <w:hyperlink r:id="rId17" w:tgtFrame="_blank" w:history="1">
               <w:r>
                 <w:rPr>
                   <w:rStyle w:val="Hyperlink"/>
@@ -3936,7 +4754,7 @@
               <w:pStyle w:val="NormalWeb"/>
               <w:spacing w:before="0" w:beforeAutospacing="0" w:after="0" w:afterAutospacing="0"/>
             </w:pPr>
-            <w:hyperlink r:id="rId15" w:history="1">
+            <w:hyperlink r:id="rId18" w:history="1">
               <w:r>
                 <w:rPr>
                   <w:rStyle w:val="Hyperlink"/>
@@ -3944,8 +4762,19 @@
                   <w:sz w:val="20"/>
                   <w:szCs w:val="20"/>
                 </w:rPr>
-                <w:t>shanemccarty.github.io/FRImindsets</w:t>
+                <w:t>shanemccarty.github.io/</w:t>
               </w:r>
+              <w:proofErr w:type="spellStart"/>
+              <w:r>
+                <w:rPr>
+                  <w:rStyle w:val="Hyperlink"/>
+                  <w:rFonts w:ascii="Roboto" w:eastAsia="Times New Roman" w:hAnsi="Roboto"/>
+                  <w:sz w:val="20"/>
+                  <w:szCs w:val="20"/>
+                </w:rPr>
+                <w:t>FRImindsets</w:t>
+              </w:r>
+              <w:proofErr w:type="spellEnd"/>
             </w:hyperlink>
           </w:p>
         </w:tc>
@@ -3979,7 +4808,6 @@
                 <w:sz w:val="20"/>
                 <w:szCs w:val="20"/>
               </w:rPr>
-              <w:lastRenderedPageBreak/>
               <w:t>3.</w:t>
             </w:r>
             <w:r>
@@ -4324,7 +5152,7 @@
                 <w:lang w:val="en-US"/>
               </w:rPr>
             </w:pPr>
-            <w:hyperlink r:id="rId16" w:history="1">
+            <w:hyperlink r:id="rId19" w:history="1">
               <w:r>
                 <w:rPr>
                   <w:rStyle w:val="Hyperlink"/>
@@ -4333,7 +5161,29 @@
                   <w:szCs w:val="20"/>
                   <w:lang w:val="en-US"/>
                 </w:rPr>
-                <w:t>shanemccarty.github.io/FRIplaybook/</w:t>
+                <w:t>shanemccarty.github.io/</w:t>
+              </w:r>
+              <w:proofErr w:type="spellStart"/>
+              <w:r>
+                <w:rPr>
+                  <w:rStyle w:val="Hyperlink"/>
+                  <w:rFonts w:ascii="Roboto" w:eastAsia="Times New Roman" w:hAnsi="Roboto"/>
+                  <w:sz w:val="20"/>
+                  <w:szCs w:val="20"/>
+                  <w:lang w:val="en-US"/>
+                </w:rPr>
+                <w:t>FRIplaybook</w:t>
+              </w:r>
+              <w:proofErr w:type="spellEnd"/>
+              <w:r>
+                <w:rPr>
+                  <w:rStyle w:val="Hyperlink"/>
+                  <w:rFonts w:ascii="Roboto" w:eastAsia="Times New Roman" w:hAnsi="Roboto"/>
+                  <w:sz w:val="20"/>
+                  <w:szCs w:val="20"/>
+                  <w:lang w:val="en-US"/>
+                </w:rPr>
+                <w:t>/</w:t>
               </w:r>
             </w:hyperlink>
           </w:p>
@@ -4618,12 +5468,66 @@
             <w:r>
               <w:rPr>
                 <w:rFonts w:ascii="Roboto" w:eastAsia="Times New Roman" w:hAnsi="Roboto"/>
-                <w:bCs/>
-                <w:sz w:val="20"/>
-                <w:szCs w:val="20"/>
-                <w:lang w:eastAsia="zh-TW"/>
-              </w:rPr>
-              <w:t>Hei, Z., Giallella, J., &amp; McCarty, S. First-author poster abstract accepted for presentation</w:t>
+                <w:b/>
+                <w:sz w:val="20"/>
+                <w:szCs w:val="20"/>
+                <w:lang w:eastAsia="zh-TW"/>
+              </w:rPr>
+              <w:t>Hei, Z.,</w:t>
+            </w:r>
+            <w:r>
+              <w:rPr>
+                <w:rFonts w:ascii="Roboto" w:eastAsia="Times New Roman" w:hAnsi="Roboto"/>
+                <w:bCs/>
+                <w:sz w:val="20"/>
+                <w:szCs w:val="20"/>
+                <w:lang w:eastAsia="zh-TW"/>
+              </w:rPr>
+              <w:t xml:space="preserve"> Giallella, J., John, J., </w:t>
+            </w:r>
+            <w:proofErr w:type="spellStart"/>
+            <w:r>
+              <w:rPr>
+                <w:rFonts w:ascii="Roboto" w:eastAsia="Times New Roman" w:hAnsi="Roboto"/>
+                <w:bCs/>
+                <w:sz w:val="20"/>
+                <w:szCs w:val="20"/>
+                <w:lang w:eastAsia="zh-TW"/>
+              </w:rPr>
+              <w:t>Khalap</w:t>
+            </w:r>
+            <w:proofErr w:type="spellEnd"/>
+            <w:r>
+              <w:rPr>
+                <w:rFonts w:ascii="Roboto" w:eastAsia="Times New Roman" w:hAnsi="Roboto"/>
+                <w:bCs/>
+                <w:sz w:val="20"/>
+                <w:szCs w:val="20"/>
+                <w:lang w:eastAsia="zh-TW"/>
+              </w:rPr>
+              <w:t xml:space="preserve">, I., Booker, J., </w:t>
+            </w:r>
+            <w:proofErr w:type="spellStart"/>
+            <w:r>
+              <w:rPr>
+                <w:rFonts w:ascii="Roboto" w:eastAsia="Times New Roman" w:hAnsi="Roboto"/>
+                <w:bCs/>
+                <w:sz w:val="20"/>
+                <w:szCs w:val="20"/>
+                <w:lang w:eastAsia="zh-TW"/>
+              </w:rPr>
+              <w:t>Pacque</w:t>
+            </w:r>
+            <w:proofErr w:type="spellEnd"/>
+            <w:r>
+              <w:rPr>
+                <w:rFonts w:ascii="Roboto" w:eastAsia="Times New Roman" w:hAnsi="Roboto"/>
+                <w:bCs/>
+                <w:sz w:val="20"/>
+                <w:szCs w:val="20"/>
+                <w:lang w:eastAsia="zh-TW"/>
+              </w:rPr>
+              <w:t>, K., Rualo, G. &amp; McCarty, S</w:t>
             </w:r>
             <w:r>
               <w:rPr>
@@ -4645,7 +5549,7 @@
               </w:rPr>
               <w:t xml:space="preserve"> </w:t>
             </w:r>
-            <w:hyperlink r:id="rId17" w:history="1">
+            <w:hyperlink r:id="rId20" w:history="1">
               <w:r>
                 <w:rPr>
                   <w:rStyle w:val="Hyperlink"/>
@@ -4829,7 +5733,49 @@
                 <w:szCs w:val="20"/>
                 <w:lang w:eastAsia="zh-TW"/>
               </w:rPr>
-              <w:t>Invited presentation; McCarty, S., Hei, Z., Rualo, G., Khalap, I., &amp; Giallella, J.</w:t>
+              <w:t xml:space="preserve">Invited presentation; McCarty, S., </w:t>
+            </w:r>
+            <w:r>
+              <w:rPr>
+                <w:rFonts w:ascii="Roboto" w:eastAsia="Times New Roman" w:hAnsi="Roboto"/>
+                <w:b/>
+                <w:sz w:val="20"/>
+                <w:szCs w:val="20"/>
+                <w:lang w:eastAsia="zh-TW"/>
+              </w:rPr>
+              <w:t>Hei, Z.,</w:t>
+            </w:r>
+            <w:r>
+              <w:rPr>
+                <w:rFonts w:ascii="Roboto" w:eastAsia="Times New Roman" w:hAnsi="Roboto"/>
+                <w:bCs/>
+                <w:sz w:val="20"/>
+                <w:szCs w:val="20"/>
+                <w:lang w:eastAsia="zh-TW"/>
+              </w:rPr>
+              <w:t xml:space="preserve"> Rualo, G., </w:t>
+            </w:r>
+            <w:proofErr w:type="spellStart"/>
+            <w:r>
+              <w:rPr>
+                <w:rFonts w:ascii="Roboto" w:eastAsia="Times New Roman" w:hAnsi="Roboto"/>
+                <w:bCs/>
+                <w:sz w:val="20"/>
+                <w:szCs w:val="20"/>
+                <w:lang w:eastAsia="zh-TW"/>
+              </w:rPr>
+              <w:t>Khalap</w:t>
+            </w:r>
+            <w:proofErr w:type="spellEnd"/>
+            <w:r>
+              <w:rPr>
+                <w:rFonts w:ascii="Roboto" w:eastAsia="Times New Roman" w:hAnsi="Roboto"/>
+                <w:bCs/>
+                <w:sz w:val="20"/>
+                <w:szCs w:val="20"/>
+                <w:lang w:eastAsia="zh-TW"/>
+              </w:rPr>
+              <w:t>, I., &amp; Giallella, J.</w:t>
             </w:r>
           </w:p>
         </w:tc>
@@ -5361,15 +6307,7 @@
                 <w:sz w:val="20"/>
                 <w:szCs w:val="20"/>
               </w:rPr>
-              <w:t>MAY 202</w:t>
-            </w:r>
-            <w:r>
-              <w:rPr>
-                <w:rFonts w:ascii="Roboto" w:hAnsi="Roboto" w:cs="Times New Roman (Body CS)"/>
-                <w:sz w:val="20"/>
-                <w:szCs w:val="20"/>
-              </w:rPr>
-              <w:t>6</w:t>
+              <w:t>PRESENT</w:t>
             </w:r>
           </w:p>
         </w:tc>
@@ -5431,7 +6369,7 @@
               </w:rPr>
               <w:t xml:space="preserve"> | </w:t>
             </w:r>
-            <w:hyperlink r:id="rId18" w:history="1">
+            <w:hyperlink r:id="rId21" w:history="1">
               <w:r>
                 <w:rPr>
                   <w:rStyle w:val="Hyperlink"/>
@@ -5516,27 +6454,105 @@
                 <w:szCs w:val="20"/>
                 <w:lang w:eastAsia="zh-TW"/>
               </w:rPr>
-              <w:t xml:space="preserve">Built a </w:t>
-            </w:r>
-            <w:r>
-              <w:rPr>
-                <w:rFonts w:ascii="Roboto" w:eastAsia="Times New Roman" w:hAnsi="Roboto"/>
-                <w:bCs/>
-                <w:sz w:val="20"/>
-                <w:szCs w:val="20"/>
-                <w:lang w:eastAsia="zh-TW"/>
-              </w:rPr>
-              <w:t xml:space="preserve">YOLO26-based </w:t>
-            </w:r>
-            <w:r>
-              <w:rPr>
-                <w:rFonts w:ascii="Roboto" w:eastAsia="Times New Roman" w:hAnsi="Roboto"/>
-                <w:bCs/>
-                <w:sz w:val="20"/>
-                <w:szCs w:val="20"/>
-                <w:lang w:eastAsia="zh-TW"/>
-              </w:rPr>
-              <w:t>deep-learning model to classify thyroid histopathology images and evaluated confusion matrices, Type I/II errors, class imbalance, and dataset representativeness.</w:t>
+              <w:t>Develop a YOLO26-based deep-learning workflow for thyroid cancer, abnormal, and normal histopathology tissue detection, including model training, evaluation, and error analysis.</w:t>
+            </w:r>
+          </w:p>
+          <w:p>
+            <w:pPr>
+              <w:pStyle w:val="ListParagraph"/>
+              <w:numPr>
+                <w:ilvl w:val="0"/>
+                <w:numId w:val="1"/>
+              </w:numPr>
+              <w:spacing w:after="80"/>
+              <w:ind w:left="357" w:right="567" w:hanging="357"/>
+              <w:contextualSpacing w:val="0"/>
+              <w:rPr>
+                <w:rFonts w:ascii="Roboto" w:eastAsia="Times New Roman" w:hAnsi="Roboto"/>
+                <w:bCs/>
+                <w:sz w:val="20"/>
+                <w:szCs w:val="20"/>
+                <w:lang w:eastAsia="zh-TW"/>
+              </w:rPr>
+            </w:pPr>
+            <w:r>
+              <w:rPr>
+                <w:rFonts w:ascii="Roboto" w:eastAsia="Times New Roman" w:hAnsi="Roboto"/>
+                <w:bCs/>
+                <w:sz w:val="20"/>
+                <w:szCs w:val="20"/>
+                <w:lang w:eastAsia="zh-TW"/>
+              </w:rPr>
+              <w:t>Evaluate model performance through Type I (false positive) and Type II (false negative) error analysis and interpret confusion matrices for class imbalance and dataset representativeness.</w:t>
+            </w:r>
+          </w:p>
+          <w:p>
+            <w:pPr>
+              <w:pStyle w:val="ListParagraph"/>
+              <w:numPr>
+                <w:ilvl w:val="0"/>
+                <w:numId w:val="1"/>
+              </w:numPr>
+              <w:spacing w:after="80"/>
+              <w:ind w:left="357" w:right="567" w:hanging="357"/>
+              <w:contextualSpacing w:val="0"/>
+              <w:rPr>
+                <w:rFonts w:ascii="Roboto" w:eastAsia="Times New Roman" w:hAnsi="Roboto"/>
+                <w:bCs/>
+                <w:sz w:val="20"/>
+                <w:szCs w:val="20"/>
+                <w:lang w:eastAsia="zh-TW"/>
+              </w:rPr>
+            </w:pPr>
+            <w:r>
+              <w:rPr>
+                <w:rFonts w:ascii="Roboto" w:eastAsia="Times New Roman" w:hAnsi="Roboto"/>
+                <w:bCs/>
+                <w:sz w:val="20"/>
+                <w:szCs w:val="20"/>
+                <w:lang w:eastAsia="zh-TW"/>
+              </w:rPr>
+              <w:t>Visualize and document model performance and limitations for potential pre-screening applications</w:t>
+            </w:r>
+            <w:r>
+              <w:rPr>
+                <w:rFonts w:ascii="Roboto" w:eastAsia="Times New Roman" w:hAnsi="Roboto"/>
+                <w:bCs/>
+                <w:sz w:val="20"/>
+                <w:szCs w:val="20"/>
+                <w:lang w:eastAsia="zh-TW"/>
+              </w:rPr>
+              <w:t xml:space="preserve"> (</w:t>
+            </w:r>
+            <w:r>
+              <w:rPr>
+                <w:rFonts w:ascii="Roboto" w:eastAsia="Times New Roman" w:hAnsi="Roboto"/>
+                <w:bCs/>
+                <w:sz w:val="20"/>
+                <w:szCs w:val="20"/>
+                <w:lang w:eastAsia="zh-TW"/>
+              </w:rPr>
+              <w:t>manuscript in preparation</w:t>
+            </w:r>
+            <w:r>
+              <w:rPr>
+                <w:rFonts w:ascii="Roboto" w:eastAsia="Times New Roman" w:hAnsi="Roboto"/>
+                <w:bCs/>
+                <w:sz w:val="20"/>
+                <w:szCs w:val="20"/>
+                <w:lang w:eastAsia="zh-TW"/>
+              </w:rPr>
+              <w:t>)</w:t>
+            </w:r>
+            <w:r>
+              <w:rPr>
+                <w:rFonts w:ascii="Roboto" w:eastAsia="Times New Roman" w:hAnsi="Roboto"/>
+                <w:bCs/>
+                <w:sz w:val="20"/>
+                <w:szCs w:val="20"/>
+                <w:lang w:eastAsia="zh-TW"/>
+              </w:rPr>
+              <w:t>.</w:t>
             </w:r>
           </w:p>
         </w:tc>
@@ -5692,7 +6708,7 @@
               </w:rPr>
               <w:t xml:space="preserve"> | </w:t>
             </w:r>
-            <w:hyperlink r:id="rId19" w:history="1">
+            <w:hyperlink r:id="rId22" w:history="1">
               <w:r>
                 <w:rPr>
                   <w:rStyle w:val="Hyperlink"/>
@@ -5743,6 +6759,7 @@
                 <w:szCs w:val="21"/>
                 <w:lang w:eastAsia="zh-TW"/>
               </w:rPr>
+              <w:lastRenderedPageBreak/>
               <w:t>Digital &amp; Data Studies Group Project | Binghamton University</w:t>
             </w:r>
           </w:p>
@@ -5784,7 +6801,49 @@
                 <w:szCs w:val="20"/>
                 <w:lang w:eastAsia="zh-TW"/>
               </w:rPr>
-              <w:t>Implemented PyTorch reinforcement-learning agents for Tic-Tac-Toe and Connect Four through self-play and visualized training performance.</w:t>
+              <w:t xml:space="preserve">Implemented </w:t>
+            </w:r>
+            <w:proofErr w:type="spellStart"/>
+            <w:r>
+              <w:rPr>
+                <w:rFonts w:ascii="Roboto" w:eastAsia="Times New Roman" w:hAnsi="Roboto"/>
+                <w:bCs/>
+                <w:sz w:val="20"/>
+                <w:szCs w:val="20"/>
+                <w:lang w:eastAsia="zh-TW"/>
+              </w:rPr>
+              <w:t>PyTorch</w:t>
+            </w:r>
+            <w:proofErr w:type="spellEnd"/>
+            <w:r>
+              <w:rPr>
+                <w:rFonts w:ascii="Roboto" w:eastAsia="Times New Roman" w:hAnsi="Roboto"/>
+                <w:bCs/>
+                <w:sz w:val="20"/>
+                <w:szCs w:val="20"/>
+                <w:lang w:eastAsia="zh-TW"/>
+              </w:rPr>
+              <w:t xml:space="preserve"> reinforcement-learning agents for Tic-Tac-Toe and Connect Four through self-play and visualized training performance</w:t>
+            </w:r>
+            <w:r>
+              <w:rPr>
+                <w:rFonts w:ascii="Roboto" w:eastAsia="Times New Roman" w:hAnsi="Roboto"/>
+                <w:bCs/>
+                <w:sz w:val="20"/>
+                <w:szCs w:val="20"/>
+                <w:lang w:eastAsia="zh-TW"/>
+              </w:rPr>
+              <w:t xml:space="preserve"> using Matplotlib</w:t>
+            </w:r>
+            <w:r>
+              <w:rPr>
+                <w:rFonts w:ascii="Roboto" w:eastAsia="Times New Roman" w:hAnsi="Roboto"/>
+                <w:bCs/>
+                <w:sz w:val="20"/>
+                <w:szCs w:val="20"/>
+                <w:lang w:eastAsia="zh-TW"/>
+              </w:rPr>
+              <w:t>.</w:t>
             </w:r>
           </w:p>
         </w:tc>
@@ -5799,21 +6858,6 @@
             <w:tcW w:w="11957" w:type="dxa"/>
             <w:gridSpan w:val="4"/>
           </w:tcPr>
-          <w:p>
-            <w:pPr>
-              <w:pStyle w:val="NormalWeb"/>
-              <w:spacing w:before="0" w:beforeAutospacing="0" w:after="0" w:afterAutospacing="0" w:line="276" w:lineRule="auto"/>
-              <w:rPr>
-                <w:rFonts w:ascii="Roboto" w:eastAsia="Times New Roman" w:hAnsi="Roboto"/>
-                <w:b/>
-                <w:bCs/>
-                <w:color w:val="2D4239"/>
-                <w:sz w:val="22"/>
-                <w:szCs w:val="22"/>
-                <w:lang w:val="en-US"/>
-              </w:rPr>
-            </w:pPr>
-          </w:p>
           <w:p>
             <w:pPr>
               <w:pStyle w:val="NormalWeb"/>
@@ -5938,15 +6982,7 @@
                       <w:sz w:val="20"/>
                       <w:szCs w:val="20"/>
                     </w:rPr>
-                    <w:t>2</w:t>
-                  </w:r>
-                  <w:r>
-                    <w:rPr>
-                      <w:rFonts w:ascii="Roboto" w:hAnsi="Roboto" w:cs="Times New Roman (Body CS)"/>
-                      <w:sz w:val="20"/>
-                      <w:szCs w:val="20"/>
-                    </w:rPr>
-                    <w:t>6</w:t>
+                    <w:t>26</w:t>
                   </w:r>
                   <w:r>
                     <w:rPr>
@@ -6079,28 +7115,8 @@
                       <w:szCs w:val="20"/>
                       <w:lang w:eastAsia="zh-TW"/>
                     </w:rPr>
-                    <w:lastRenderedPageBreak/>
-                    <w:t>Design promotional graphics and event materials, including posters, to support club events, outreach, and student engagement.</w:t>
+                    <w:t>Design the club logo and promotional materials, including event posters, workshop graphics, and outreach visuals</w:t>
                   </w:r>
-                </w:p>
-                <w:p>
-                  <w:pPr>
-                    <w:pStyle w:val="ListParagraph"/>
-                    <w:numPr>
-                      <w:ilvl w:val="0"/>
-                      <w:numId w:val="1"/>
-                    </w:numPr>
-                    <w:spacing w:after="80"/>
-                    <w:ind w:left="357" w:right="567" w:hanging="357"/>
-                    <w:contextualSpacing w:val="0"/>
-                    <w:rPr>
-                      <w:rFonts w:ascii="Roboto" w:eastAsia="Times New Roman" w:hAnsi="Roboto"/>
-                      <w:bCs/>
-                      <w:sz w:val="20"/>
-                      <w:szCs w:val="20"/>
-                      <w:lang w:eastAsia="zh-TW"/>
-                    </w:rPr>
-                  </w:pPr>
                   <w:r>
                     <w:rPr>
                       <w:rFonts w:ascii="Roboto" w:eastAsia="Times New Roman" w:hAnsi="Roboto"/>
@@ -6109,7 +7125,7 @@
                       <w:szCs w:val="20"/>
                       <w:lang w:eastAsia="zh-TW"/>
                     </w:rPr>
-                    <w:t>Develop logo and branding concepts in collaboration with the executive board.</w:t>
+                    <w:t>.</w:t>
                   </w:r>
                 </w:p>
               </w:tc>
@@ -6408,7 +7424,47 @@
                 <w:szCs w:val="20"/>
                 <w:lang w:eastAsia="zh-TW"/>
               </w:rPr>
-              <w:t>Year-long research stipend supporting transcriptomic biomarker discovery and validation in chemo-immunotherapy with Dr. Nancy Guo.</w:t>
+              <w:t>Awarded</w:t>
+            </w:r>
+            <w:r>
+              <w:rPr>
+                <w:rFonts w:ascii="Roboto" w:eastAsia="Times New Roman" w:hAnsi="Roboto"/>
+                <w:bCs/>
+                <w:sz w:val="20"/>
+                <w:szCs w:val="20"/>
+                <w:lang w:eastAsia="zh-TW"/>
+              </w:rPr>
+              <w:t xml:space="preserve"> an $8,000 y</w:t>
+            </w:r>
+            <w:r>
+              <w:rPr>
+                <w:rFonts w:ascii="Roboto" w:eastAsia="Times New Roman" w:hAnsi="Roboto"/>
+                <w:bCs/>
+                <w:sz w:val="20"/>
+                <w:szCs w:val="20"/>
+                <w:lang w:eastAsia="zh-TW"/>
+              </w:rPr>
+              <w:t xml:space="preserve">ear-long </w:t>
+            </w:r>
+            <w:r>
+              <w:rPr>
+                <w:rFonts w:ascii="Roboto" w:eastAsia="Times New Roman" w:hAnsi="Roboto"/>
+                <w:bCs/>
+                <w:sz w:val="20"/>
+                <w:szCs w:val="20"/>
+                <w:lang w:eastAsia="zh-TW"/>
+              </w:rPr>
+              <w:t xml:space="preserve">NSF REU </w:t>
+            </w:r>
+            <w:r>
+              <w:rPr>
+                <w:rFonts w:ascii="Roboto" w:eastAsia="Times New Roman" w:hAnsi="Roboto"/>
+                <w:bCs/>
+                <w:sz w:val="20"/>
+                <w:szCs w:val="20"/>
+                <w:lang w:eastAsia="zh-TW"/>
+              </w:rPr>
+              <w:t>research stipend supporting transcriptomic biomarker discovery and validation in chemo-immunotherapy with Dr. Nancy Guo.</w:t>
             </w:r>
           </w:p>
         </w:tc>
@@ -6580,7 +7636,47 @@
                 <w:szCs w:val="20"/>
                 <w:lang w:eastAsia="zh-TW"/>
               </w:rPr>
-              <w:t>Awarded summer internship funding to support a quantitative research internship with the First-year Research Immersion (FRI) program.</w:t>
+              <w:t xml:space="preserve">Awarded </w:t>
+            </w:r>
+            <w:r>
+              <w:rPr>
+                <w:rFonts w:ascii="Roboto" w:eastAsia="Times New Roman" w:hAnsi="Roboto"/>
+                <w:bCs/>
+                <w:sz w:val="20"/>
+                <w:szCs w:val="20"/>
+                <w:lang w:eastAsia="zh-TW"/>
+              </w:rPr>
+              <w:t xml:space="preserve">$3,000 in </w:t>
+            </w:r>
+            <w:r>
+              <w:rPr>
+                <w:rFonts w:ascii="Roboto" w:eastAsia="Times New Roman" w:hAnsi="Roboto"/>
+                <w:bCs/>
+                <w:sz w:val="20"/>
+                <w:szCs w:val="20"/>
+                <w:lang w:eastAsia="zh-TW"/>
+              </w:rPr>
+              <w:t xml:space="preserve">summer internship funding to support </w:t>
+            </w:r>
+            <w:r>
+              <w:rPr>
+                <w:rFonts w:ascii="Roboto" w:eastAsia="Times New Roman" w:hAnsi="Roboto"/>
+                <w:bCs/>
+                <w:sz w:val="20"/>
+                <w:szCs w:val="20"/>
+                <w:lang w:eastAsia="zh-TW"/>
+              </w:rPr>
+              <w:t xml:space="preserve">a </w:t>
+            </w:r>
+            <w:r>
+              <w:rPr>
+                <w:rFonts w:ascii="Roboto" w:eastAsia="Times New Roman" w:hAnsi="Roboto"/>
+                <w:bCs/>
+                <w:sz w:val="20"/>
+                <w:szCs w:val="20"/>
+                <w:lang w:eastAsia="zh-TW"/>
+              </w:rPr>
+              <w:t>quantitative research internship with the First-year Research Immersion program.</w:t>
             </w:r>
           </w:p>
         </w:tc>
@@ -7146,21 +8242,6 @@
               <w:spacing w:before="0" w:beforeAutospacing="0" w:after="0" w:afterAutospacing="0"/>
               <w:rPr>
                 <w:rFonts w:ascii="Roboto" w:eastAsia="Times New Roman" w:hAnsi="Roboto"/>
-                <w:b/>
-                <w:bCs/>
-                <w:color w:val="2D4239"/>
-                <w:sz w:val="32"/>
-                <w:szCs w:val="32"/>
-                <w:lang w:val="en-US"/>
-              </w:rPr>
-            </w:pPr>
-          </w:p>
-          <w:p>
-            <w:pPr>
-              <w:pStyle w:val="NormalWeb"/>
-              <w:spacing w:before="0" w:beforeAutospacing="0" w:after="0" w:afterAutospacing="0"/>
-              <w:rPr>
-                <w:rFonts w:ascii="Roboto" w:eastAsia="Times New Roman" w:hAnsi="Roboto"/>
                 <w:color w:val="2D4239"/>
                 <w:sz w:val="28"/>
                 <w:szCs w:val="28"/>
@@ -7257,15 +8338,43 @@
                 <w:sz w:val="20"/>
                 <w:szCs w:val="20"/>
               </w:rPr>
-              <w:t>: R (tidyverse</w:t>
-            </w:r>
-            <w:r>
-              <w:rPr>
-                <w:rFonts w:ascii="Roboto" w:eastAsia="Times New Roman" w:hAnsi="Roboto"/>
-                <w:sz w:val="20"/>
-                <w:szCs w:val="20"/>
-              </w:rPr>
-              <w:t>, tidymodels, caret</w:t>
+              <w:t>: R (</w:t>
+            </w:r>
+            <w:proofErr w:type="spellStart"/>
+            <w:r>
+              <w:rPr>
+                <w:rFonts w:ascii="Roboto" w:eastAsia="Times New Roman" w:hAnsi="Roboto"/>
+                <w:sz w:val="20"/>
+                <w:szCs w:val="20"/>
+              </w:rPr>
+              <w:t>tidyverse</w:t>
+            </w:r>
+            <w:proofErr w:type="spellEnd"/>
+            <w:r>
+              <w:rPr>
+                <w:rFonts w:ascii="Roboto" w:eastAsia="Times New Roman" w:hAnsi="Roboto"/>
+                <w:sz w:val="20"/>
+                <w:szCs w:val="20"/>
+              </w:rPr>
+              <w:t xml:space="preserve">, </w:t>
+            </w:r>
+            <w:proofErr w:type="spellStart"/>
+            <w:r>
+              <w:rPr>
+                <w:rFonts w:ascii="Roboto" w:eastAsia="Times New Roman" w:hAnsi="Roboto"/>
+                <w:sz w:val="20"/>
+                <w:szCs w:val="20"/>
+              </w:rPr>
+              <w:t>tidymodels</w:t>
+            </w:r>
+            <w:proofErr w:type="spellEnd"/>
+            <w:r>
+              <w:rPr>
+                <w:rFonts w:ascii="Roboto" w:eastAsia="Times New Roman" w:hAnsi="Roboto"/>
+                <w:sz w:val="20"/>
+                <w:szCs w:val="20"/>
+              </w:rPr>
+              <w:t>, caret</w:t>
             </w:r>
             <w:r>
               <w:rPr>
@@ -7281,7 +8390,25 @@
                 <w:sz w:val="20"/>
                 <w:szCs w:val="20"/>
               </w:rPr>
-              <w:t>Python (Pandas, NumPy, scikit-learn, PyTorch), SPSS</w:t>
+              <w:t xml:space="preserve">Python (Pandas, NumPy, scikit-learn, </w:t>
+            </w:r>
+            <w:proofErr w:type="spellStart"/>
+            <w:r>
+              <w:rPr>
+                <w:rFonts w:ascii="Roboto" w:eastAsia="Times New Roman" w:hAnsi="Roboto"/>
+                <w:sz w:val="20"/>
+                <w:szCs w:val="20"/>
+              </w:rPr>
+              <w:t>PyTorch</w:t>
+            </w:r>
+            <w:proofErr w:type="spellEnd"/>
+            <w:r>
+              <w:rPr>
+                <w:rFonts w:ascii="Roboto" w:eastAsia="Times New Roman" w:hAnsi="Roboto"/>
+                <w:sz w:val="20"/>
+                <w:szCs w:val="20"/>
+              </w:rPr>
+              <w:t>), SPSS</w:t>
             </w:r>
             <w:r>
               <w:rPr>
@@ -7307,7 +8434,25 @@
                 <w:sz w:val="20"/>
                 <w:szCs w:val="20"/>
               </w:rPr>
-              <w:t>: ggplot2, Plotly, Matplotlib, Observable JS, R Shiny, Qualtrics</w:t>
+              <w:t xml:space="preserve">: ggplot2, </w:t>
+            </w:r>
+            <w:proofErr w:type="spellStart"/>
+            <w:r>
+              <w:rPr>
+                <w:rFonts w:ascii="Roboto" w:eastAsia="Times New Roman" w:hAnsi="Roboto"/>
+                <w:sz w:val="20"/>
+                <w:szCs w:val="20"/>
+              </w:rPr>
+              <w:t>Plotly</w:t>
+            </w:r>
+            <w:proofErr w:type="spellEnd"/>
+            <w:r>
+              <w:rPr>
+                <w:rFonts w:ascii="Roboto" w:eastAsia="Times New Roman" w:hAnsi="Roboto"/>
+                <w:sz w:val="20"/>
+                <w:szCs w:val="20"/>
+              </w:rPr>
+              <w:t>, Matplotlib, Observable JS, R Shiny, Qualtrics</w:t>
             </w:r>
             <w:r>
               <w:rPr>

</xml_diff>